<commit_message>
added conceptual model, made some modifications of the use cases, updated readme
</commit_message>
<xml_diff>
--- a/use_cases.docx
+++ b/use_cases.docx
@@ -111,8 +111,18 @@
                 <w:bCs/>
                 <w:color w:val="000000" w:themeColor="text1"/>
               </w:rPr>
-              <w:t>-1: SignUp</w:t>
-            </w:r>
+              <w:t xml:space="preserve">-1: </w:t>
+            </w:r>
+            <w:proofErr w:type="spellStart"/>
+            <w:r>
+              <w:rPr>
+                <w:b/>
+                <w:bCs/>
+                <w:color w:val="000000" w:themeColor="text1"/>
+              </w:rPr>
+              <w:t>SignUp</w:t>
+            </w:r>
+            <w:proofErr w:type="spellEnd"/>
           </w:p>
         </w:tc>
       </w:tr>
@@ -266,7 +276,21 @@
               <w:rPr>
                 <w:color w:val="000000" w:themeColor="text1"/>
               </w:rPr>
-              <w:t>In order for the user to join bookclubs, they must first create an account and log in. The user will have to input relevant data in order to create an account</w:t>
+              <w:t xml:space="preserve">In order for the user to join </w:t>
+            </w:r>
+            <w:proofErr w:type="spellStart"/>
+            <w:r>
+              <w:rPr>
+                <w:color w:val="000000" w:themeColor="text1"/>
+              </w:rPr>
+              <w:t>bookclubs</w:t>
+            </w:r>
+            <w:proofErr w:type="spellEnd"/>
+            <w:r>
+              <w:rPr>
+                <w:color w:val="000000" w:themeColor="text1"/>
+              </w:rPr>
+              <w:t>, they must first create an account and log in. The user will have to input relevant data in order to create an account</w:t>
             </w:r>
           </w:p>
         </w:tc>
@@ -780,15 +804,29 @@
             <w:pPr>
               <w:jc w:val="left"/>
               <w:rPr>
-                <w:color w:val="000000" w:themeColor="text1"/>
-              </w:rPr>
-            </w:pPr>
-            <w:r>
-              <w:rPr>
-                <w:color w:val="000000" w:themeColor="text1"/>
-              </w:rPr>
-              <w:t>UC-2: Create a bookclub</w:t>
-            </w:r>
+                <w:b/>
+                <w:bCs/>
+                <w:color w:val="000000" w:themeColor="text1"/>
+              </w:rPr>
+            </w:pPr>
+            <w:r>
+              <w:rPr>
+                <w:b/>
+                <w:bCs/>
+                <w:color w:val="000000" w:themeColor="text1"/>
+              </w:rPr>
+              <w:t xml:space="preserve">UC-2: Create a </w:t>
+            </w:r>
+            <w:proofErr w:type="spellStart"/>
+            <w:r>
+              <w:rPr>
+                <w:b/>
+                <w:bCs/>
+                <w:color w:val="000000" w:themeColor="text1"/>
+              </w:rPr>
+              <w:t>bookclub</w:t>
+            </w:r>
+            <w:proofErr w:type="spellEnd"/>
           </w:p>
         </w:tc>
       </w:tr>
@@ -942,7 +980,21 @@
               <w:rPr>
                 <w:color w:val="000000" w:themeColor="text1"/>
               </w:rPr>
-              <w:t>A User wants to create a bookclub.</w:t>
+              <w:t xml:space="preserve">A User wants to create a </w:t>
+            </w:r>
+            <w:proofErr w:type="spellStart"/>
+            <w:r>
+              <w:rPr>
+                <w:color w:val="000000" w:themeColor="text1"/>
+              </w:rPr>
+              <w:t>bookclub</w:t>
+            </w:r>
+            <w:proofErr w:type="spellEnd"/>
+            <w:r>
+              <w:rPr>
+                <w:color w:val="000000" w:themeColor="text1"/>
+              </w:rPr>
+              <w:t>.</w:t>
             </w:r>
           </w:p>
         </w:tc>
@@ -1018,12 +1070,14 @@
               </w:rPr>
               <w:t xml:space="preserve">a </w:t>
             </w:r>
+            <w:proofErr w:type="spellStart"/>
             <w:r>
               <w:rPr>
                 <w:color w:val="000000" w:themeColor="text1"/>
               </w:rPr>
               <w:t>bookclub</w:t>
             </w:r>
+            <w:proofErr w:type="spellEnd"/>
           </w:p>
         </w:tc>
       </w:tr>
@@ -1135,22 +1189,66 @@
               <w:rPr>
                 <w:color w:val="000000" w:themeColor="text1"/>
               </w:rPr>
-              <w:t>POST-1: A bookclub is created with the selected epub</w:t>
-            </w:r>
-          </w:p>
-          <w:p>
-            <w:pPr>
-              <w:jc w:val="left"/>
-              <w:rPr>
-                <w:color w:val="000000" w:themeColor="text1"/>
-              </w:rPr>
-            </w:pPr>
-            <w:r>
-              <w:rPr>
-                <w:color w:val="000000" w:themeColor="text1"/>
-              </w:rPr>
-              <w:t>POST-2: The user who created the bookclub is given admin rights over that bookclub</w:t>
-            </w:r>
+              <w:t xml:space="preserve">POST-1: A </w:t>
+            </w:r>
+            <w:proofErr w:type="spellStart"/>
+            <w:r>
+              <w:rPr>
+                <w:color w:val="000000" w:themeColor="text1"/>
+              </w:rPr>
+              <w:t>bookclub</w:t>
+            </w:r>
+            <w:proofErr w:type="spellEnd"/>
+            <w:r>
+              <w:rPr>
+                <w:color w:val="000000" w:themeColor="text1"/>
+              </w:rPr>
+              <w:t xml:space="preserve"> is created with the selected </w:t>
+            </w:r>
+            <w:proofErr w:type="spellStart"/>
+            <w:r>
+              <w:rPr>
+                <w:color w:val="000000" w:themeColor="text1"/>
+              </w:rPr>
+              <w:t>epub</w:t>
+            </w:r>
+            <w:proofErr w:type="spellEnd"/>
+          </w:p>
+          <w:p>
+            <w:pPr>
+              <w:jc w:val="left"/>
+              <w:rPr>
+                <w:color w:val="000000" w:themeColor="text1"/>
+              </w:rPr>
+            </w:pPr>
+            <w:r>
+              <w:rPr>
+                <w:color w:val="000000" w:themeColor="text1"/>
+              </w:rPr>
+              <w:t xml:space="preserve">POST-2: The user who created the </w:t>
+            </w:r>
+            <w:proofErr w:type="spellStart"/>
+            <w:r>
+              <w:rPr>
+                <w:color w:val="000000" w:themeColor="text1"/>
+              </w:rPr>
+              <w:t>bookclub</w:t>
+            </w:r>
+            <w:proofErr w:type="spellEnd"/>
+            <w:r>
+              <w:rPr>
+                <w:color w:val="000000" w:themeColor="text1"/>
+              </w:rPr>
+              <w:t xml:space="preserve"> is given admin rights over that </w:t>
+            </w:r>
+            <w:proofErr w:type="spellStart"/>
+            <w:r>
+              <w:rPr>
+                <w:color w:val="000000" w:themeColor="text1"/>
+              </w:rPr>
+              <w:t>bookclub</w:t>
+            </w:r>
+            <w:proofErr w:type="spellEnd"/>
           </w:p>
         </w:tc>
       </w:tr>
@@ -1214,7 +1312,25 @@
                 <w:bCs/>
                 <w:color w:val="000000" w:themeColor="text1"/>
               </w:rPr>
-              <w:t>Create Bookclub:</w:t>
+              <w:t xml:space="preserve">Create </w:t>
+            </w:r>
+            <w:proofErr w:type="spellStart"/>
+            <w:r>
+              <w:rPr>
+                <w:b/>
+                <w:bCs/>
+                <w:color w:val="000000" w:themeColor="text1"/>
+              </w:rPr>
+              <w:t>Bookclub</w:t>
+            </w:r>
+            <w:proofErr w:type="spellEnd"/>
+            <w:r>
+              <w:rPr>
+                <w:b/>
+                <w:bCs/>
+                <w:color w:val="000000" w:themeColor="text1"/>
+              </w:rPr>
+              <w:t>:</w:t>
             </w:r>
           </w:p>
           <w:p>
@@ -1250,11 +1366,19 @@
               </w:rPr>
               <w:t xml:space="preserve">User inputs </w:t>
             </w:r>
-            <w:r>
-              <w:rPr>
-                <w:color w:val="000000" w:themeColor="text1"/>
-              </w:rPr>
-              <w:t>bookclub name [it does not have to be unique]</w:t>
+            <w:proofErr w:type="spellStart"/>
+            <w:r>
+              <w:rPr>
+                <w:color w:val="000000" w:themeColor="text1"/>
+              </w:rPr>
+              <w:t>bookclub</w:t>
+            </w:r>
+            <w:proofErr w:type="spellEnd"/>
+            <w:r>
+              <w:rPr>
+                <w:color w:val="000000" w:themeColor="text1"/>
+              </w:rPr>
+              <w:t xml:space="preserve"> name [it does not have to be unique]</w:t>
             </w:r>
             <w:r>
               <w:rPr>
@@ -1278,22 +1402,58 @@
               <w:rPr>
                 <w:color w:val="000000" w:themeColor="text1"/>
               </w:rPr>
-              <w:t xml:space="preserve"> .epub file </w:t>
-            </w:r>
-          </w:p>
-          <w:p>
-            <w:pPr>
-              <w:jc w:val="left"/>
-              <w:rPr>
-                <w:color w:val="000000" w:themeColor="text1"/>
-              </w:rPr>
-            </w:pPr>
-            <w:r>
-              <w:rPr>
-                <w:color w:val="000000" w:themeColor="text1"/>
-              </w:rPr>
-              <w:t>2.        System validates the epub and generates a unique identifier for the bookclub</w:t>
-            </w:r>
+              <w:t xml:space="preserve"> .</w:t>
+            </w:r>
+            <w:proofErr w:type="spellStart"/>
+            <w:r>
+              <w:rPr>
+                <w:color w:val="000000" w:themeColor="text1"/>
+              </w:rPr>
+              <w:t>epub</w:t>
+            </w:r>
+            <w:proofErr w:type="spellEnd"/>
+            <w:r>
+              <w:rPr>
+                <w:color w:val="000000" w:themeColor="text1"/>
+              </w:rPr>
+              <w:t xml:space="preserve"> file </w:t>
+            </w:r>
+          </w:p>
+          <w:p>
+            <w:pPr>
+              <w:jc w:val="left"/>
+              <w:rPr>
+                <w:color w:val="000000" w:themeColor="text1"/>
+              </w:rPr>
+            </w:pPr>
+            <w:r>
+              <w:rPr>
+                <w:color w:val="000000" w:themeColor="text1"/>
+              </w:rPr>
+              <w:t xml:space="preserve">2.        System validates the </w:t>
+            </w:r>
+            <w:proofErr w:type="spellStart"/>
+            <w:r>
+              <w:rPr>
+                <w:color w:val="000000" w:themeColor="text1"/>
+              </w:rPr>
+              <w:t>epub</w:t>
+            </w:r>
+            <w:proofErr w:type="spellEnd"/>
+            <w:r>
+              <w:rPr>
+                <w:color w:val="000000" w:themeColor="text1"/>
+              </w:rPr>
+              <w:t xml:space="preserve"> and generates a unique identifier for the </w:t>
+            </w:r>
+            <w:proofErr w:type="spellStart"/>
+            <w:r>
+              <w:rPr>
+                <w:color w:val="000000" w:themeColor="text1"/>
+              </w:rPr>
+              <w:t>bookclub</w:t>
+            </w:r>
+            <w:proofErr w:type="spellEnd"/>
           </w:p>
           <w:p>
             <w:pPr>
@@ -1414,21 +1574,43 @@
               <w:rPr>
                 <w:color w:val="000000" w:themeColor="text1"/>
               </w:rPr>
-              <w:t>the bookclub</w:t>
-            </w:r>
-          </w:p>
-          <w:p>
-            <w:pPr>
-              <w:jc w:val="left"/>
-              <w:rPr>
-                <w:color w:val="000000" w:themeColor="text1"/>
-              </w:rPr>
-            </w:pPr>
-            <w:r>
-              <w:rPr>
-                <w:color w:val="000000" w:themeColor="text1"/>
-              </w:rPr>
-              <w:t>3.4       System redirects the user to the bookclubs page</w:t>
+              <w:t xml:space="preserve">the </w:t>
+            </w:r>
+            <w:proofErr w:type="spellStart"/>
+            <w:r>
+              <w:rPr>
+                <w:color w:val="000000" w:themeColor="text1"/>
+              </w:rPr>
+              <w:t>bookclub</w:t>
+            </w:r>
+            <w:proofErr w:type="spellEnd"/>
+          </w:p>
+          <w:p>
+            <w:pPr>
+              <w:jc w:val="left"/>
+              <w:rPr>
+                <w:color w:val="000000" w:themeColor="text1"/>
+              </w:rPr>
+            </w:pPr>
+            <w:r>
+              <w:rPr>
+                <w:color w:val="000000" w:themeColor="text1"/>
+              </w:rPr>
+              <w:t xml:space="preserve">3.4       System redirects the user to the </w:t>
+            </w:r>
+            <w:proofErr w:type="spellStart"/>
+            <w:r>
+              <w:rPr>
+                <w:color w:val="000000" w:themeColor="text1"/>
+              </w:rPr>
+              <w:t>bookclubs</w:t>
+            </w:r>
+            <w:proofErr w:type="spellEnd"/>
+            <w:r>
+              <w:rPr>
+                <w:color w:val="000000" w:themeColor="text1"/>
+              </w:rPr>
+              <w:t xml:space="preserve"> page</w:t>
             </w:r>
           </w:p>
           <w:p>
@@ -1524,10 +1706,6 @@
         </w:tc>
       </w:tr>
     </w:tbl>
-    <w:p/>
-    <w:p/>
-    <w:p/>
-    <w:p/>
     <w:p/>
     <w:p/>
     <w:tbl>
@@ -1587,15 +1765,29 @@
             <w:pPr>
               <w:jc w:val="left"/>
               <w:rPr>
-                <w:color w:val="000000" w:themeColor="text1"/>
-              </w:rPr>
-            </w:pPr>
-            <w:r>
-              <w:rPr>
-                <w:color w:val="000000" w:themeColor="text1"/>
-              </w:rPr>
-              <w:t>UC-3: Join a Bookclub</w:t>
-            </w:r>
+                <w:b/>
+                <w:bCs/>
+                <w:color w:val="000000" w:themeColor="text1"/>
+              </w:rPr>
+            </w:pPr>
+            <w:r>
+              <w:rPr>
+                <w:b/>
+                <w:bCs/>
+                <w:color w:val="000000" w:themeColor="text1"/>
+              </w:rPr>
+              <w:t xml:space="preserve">UC-3: Join a </w:t>
+            </w:r>
+            <w:proofErr w:type="spellStart"/>
+            <w:r>
+              <w:rPr>
+                <w:b/>
+                <w:bCs/>
+                <w:color w:val="000000" w:themeColor="text1"/>
+              </w:rPr>
+              <w:t>Bookclub</w:t>
+            </w:r>
+            <w:proofErr w:type="spellEnd"/>
           </w:p>
         </w:tc>
       </w:tr>
@@ -1749,7 +1941,21 @@
               <w:rPr>
                 <w:color w:val="000000" w:themeColor="text1"/>
               </w:rPr>
-              <w:t>User wants to join a bookclub, using a provided unique identifier</w:t>
+              <w:t xml:space="preserve">User wants to join a </w:t>
+            </w:r>
+            <w:proofErr w:type="spellStart"/>
+            <w:r>
+              <w:rPr>
+                <w:color w:val="000000" w:themeColor="text1"/>
+              </w:rPr>
+              <w:t>bookclub</w:t>
+            </w:r>
+            <w:proofErr w:type="spellEnd"/>
+            <w:r>
+              <w:rPr>
+                <w:color w:val="000000" w:themeColor="text1"/>
+              </w:rPr>
+              <w:t>, using a provided unique identifier</w:t>
             </w:r>
           </w:p>
         </w:tc>
@@ -1823,7 +2029,21 @@
               <w:rPr>
                 <w:color w:val="000000" w:themeColor="text1"/>
               </w:rPr>
-              <w:t xml:space="preserve">join a bookclub </w:t>
+              <w:t xml:space="preserve">join a </w:t>
+            </w:r>
+            <w:proofErr w:type="spellStart"/>
+            <w:r>
+              <w:rPr>
+                <w:color w:val="000000" w:themeColor="text1"/>
+              </w:rPr>
+              <w:t>bookclub</w:t>
+            </w:r>
+            <w:proofErr w:type="spellEnd"/>
+            <w:r>
+              <w:rPr>
+                <w:color w:val="000000" w:themeColor="text1"/>
+              </w:rPr>
+              <w:t xml:space="preserve"> </w:t>
             </w:r>
           </w:p>
         </w:tc>
@@ -1853,7 +2073,6 @@
               <w:rPr>
                 <w:color w:val="000000" w:themeColor="text1"/>
               </w:rPr>
-              <w:lastRenderedPageBreak/>
               <w:t>Preconditions</w:t>
             </w:r>
           </w:p>
@@ -1936,7 +2155,21 @@
               <w:rPr>
                 <w:color w:val="000000" w:themeColor="text1"/>
               </w:rPr>
-              <w:t>POST-1: The bookclub’s member list is updated</w:t>
+              <w:t xml:space="preserve">POST-1: The </w:t>
+            </w:r>
+            <w:proofErr w:type="spellStart"/>
+            <w:r>
+              <w:rPr>
+                <w:color w:val="000000" w:themeColor="text1"/>
+              </w:rPr>
+              <w:t>bookclub’s</w:t>
+            </w:r>
+            <w:proofErr w:type="spellEnd"/>
+            <w:r>
+              <w:rPr>
+                <w:color w:val="000000" w:themeColor="text1"/>
+              </w:rPr>
+              <w:t xml:space="preserve"> member list is updated</w:t>
             </w:r>
           </w:p>
         </w:tc>
@@ -2001,8 +2234,18 @@
                 <w:bCs/>
                 <w:color w:val="000000" w:themeColor="text1"/>
               </w:rPr>
-              <w:t>User joins a bookclub</w:t>
-            </w:r>
+              <w:t xml:space="preserve">User joins a </w:t>
+            </w:r>
+            <w:proofErr w:type="spellStart"/>
+            <w:r>
+              <w:rPr>
+                <w:b/>
+                <w:bCs/>
+                <w:color w:val="000000" w:themeColor="text1"/>
+              </w:rPr>
+              <w:t>bookclub</w:t>
+            </w:r>
+            <w:proofErr w:type="spellEnd"/>
           </w:p>
           <w:p>
             <w:pPr>
@@ -2026,7 +2269,21 @@
               <w:rPr>
                 <w:color w:val="000000" w:themeColor="text1"/>
               </w:rPr>
-              <w:t>System prompts the user to input a bookclub’s unique identifier</w:t>
+              <w:t xml:space="preserve">System prompts the user to input a </w:t>
+            </w:r>
+            <w:proofErr w:type="spellStart"/>
+            <w:r>
+              <w:rPr>
+                <w:color w:val="000000" w:themeColor="text1"/>
+              </w:rPr>
+              <w:t>bookclub’s</w:t>
+            </w:r>
+            <w:proofErr w:type="spellEnd"/>
+            <w:r>
+              <w:rPr>
+                <w:color w:val="000000" w:themeColor="text1"/>
+              </w:rPr>
+              <w:t xml:space="preserve"> unique identifier</w:t>
             </w:r>
           </w:p>
           <w:p>
@@ -2070,7 +2327,50 @@
               <w:rPr>
                 <w:color w:val="000000" w:themeColor="text1"/>
               </w:rPr>
-              <w:t xml:space="preserve">           System finds the bookclub with the associated identifier and adds the user to the bookclub. The system redirects the user to the bookclub’s page.</w:t>
+              <w:lastRenderedPageBreak/>
+              <w:t xml:space="preserve">           System finds the </w:t>
+            </w:r>
+            <w:proofErr w:type="spellStart"/>
+            <w:r>
+              <w:rPr>
+                <w:color w:val="000000" w:themeColor="text1"/>
+              </w:rPr>
+              <w:t>bookclub</w:t>
+            </w:r>
+            <w:proofErr w:type="spellEnd"/>
+            <w:r>
+              <w:rPr>
+                <w:color w:val="000000" w:themeColor="text1"/>
+              </w:rPr>
+              <w:t xml:space="preserve"> with the associated identifier and adds the user to the </w:t>
+            </w:r>
+            <w:proofErr w:type="spellStart"/>
+            <w:r>
+              <w:rPr>
+                <w:color w:val="000000" w:themeColor="text1"/>
+              </w:rPr>
+              <w:t>bookclub</w:t>
+            </w:r>
+            <w:proofErr w:type="spellEnd"/>
+            <w:r>
+              <w:rPr>
+                <w:color w:val="000000" w:themeColor="text1"/>
+              </w:rPr>
+              <w:t xml:space="preserve">. The system redirects the user to the </w:t>
+            </w:r>
+            <w:proofErr w:type="spellStart"/>
+            <w:r>
+              <w:rPr>
+                <w:color w:val="000000" w:themeColor="text1"/>
+              </w:rPr>
+              <w:t>bookclub’s</w:t>
+            </w:r>
+            <w:proofErr w:type="spellEnd"/>
+            <w:r>
+              <w:rPr>
+                <w:color w:val="000000" w:themeColor="text1"/>
+              </w:rPr>
+              <w:t xml:space="preserve"> page.</w:t>
             </w:r>
           </w:p>
         </w:tc>
@@ -2100,6 +2400,7 @@
               <w:rPr>
                 <w:color w:val="000000" w:themeColor="text1"/>
               </w:rPr>
+              <w:lastRenderedPageBreak/>
               <w:t>Alternative flows</w:t>
             </w:r>
           </w:p>
@@ -2180,7 +2481,25 @@
                 <w:bCs/>
                 <w:color w:val="000000" w:themeColor="text1"/>
               </w:rPr>
-              <w:t>4.0-E1 There is no bookclub with the associated unique identifier</w:t>
+              <w:t xml:space="preserve">4.0-E1 There is no </w:t>
+            </w:r>
+            <w:proofErr w:type="spellStart"/>
+            <w:r>
+              <w:rPr>
+                <w:b/>
+                <w:bCs/>
+                <w:color w:val="000000" w:themeColor="text1"/>
+              </w:rPr>
+              <w:t>bookclub</w:t>
+            </w:r>
+            <w:proofErr w:type="spellEnd"/>
+            <w:r>
+              <w:rPr>
+                <w:b/>
+                <w:bCs/>
+                <w:color w:val="000000" w:themeColor="text1"/>
+              </w:rPr>
+              <w:t xml:space="preserve"> with the associated unique identifier</w:t>
             </w:r>
           </w:p>
           <w:p>
@@ -2217,21 +2536,53 @@
                 <w:bCs/>
                 <w:color w:val="000000" w:themeColor="text1"/>
               </w:rPr>
-              <w:t>4.0-E2 User is already in the bookclub with the associated unique identifier</w:t>
-            </w:r>
-          </w:p>
-          <w:p>
-            <w:pPr>
-              <w:jc w:val="left"/>
-              <w:rPr>
-                <w:color w:val="000000" w:themeColor="text1"/>
-              </w:rPr>
-            </w:pPr>
-            <w:r>
-              <w:rPr>
-                <w:color w:val="000000" w:themeColor="text1"/>
-              </w:rPr>
-              <w:t xml:space="preserve">      1.             System tells the user that they already belong to said        bookclub and redirects them to the main page</w:t>
+              <w:t xml:space="preserve">4.0-E2 User is already in the </w:t>
+            </w:r>
+            <w:proofErr w:type="spellStart"/>
+            <w:r>
+              <w:rPr>
+                <w:b/>
+                <w:bCs/>
+                <w:color w:val="000000" w:themeColor="text1"/>
+              </w:rPr>
+              <w:t>bookclub</w:t>
+            </w:r>
+            <w:proofErr w:type="spellEnd"/>
+            <w:r>
+              <w:rPr>
+                <w:b/>
+                <w:bCs/>
+                <w:color w:val="000000" w:themeColor="text1"/>
+              </w:rPr>
+              <w:t xml:space="preserve"> with the associated unique identifier</w:t>
+            </w:r>
+          </w:p>
+          <w:p>
+            <w:pPr>
+              <w:jc w:val="left"/>
+              <w:rPr>
+                <w:color w:val="000000" w:themeColor="text1"/>
+              </w:rPr>
+            </w:pPr>
+            <w:r>
+              <w:rPr>
+                <w:color w:val="000000" w:themeColor="text1"/>
+              </w:rPr>
+              <w:t xml:space="preserve">      1.             System tells the user that they already belong to said        </w:t>
+            </w:r>
+            <w:proofErr w:type="spellStart"/>
+            <w:r>
+              <w:rPr>
+                <w:color w:val="000000" w:themeColor="text1"/>
+              </w:rPr>
+              <w:t>bookclub</w:t>
+            </w:r>
+            <w:proofErr w:type="spellEnd"/>
+            <w:r>
+              <w:rPr>
+                <w:color w:val="000000" w:themeColor="text1"/>
+              </w:rPr>
+              <w:t xml:space="preserve"> and redirects them to the main page</w:t>
             </w:r>
           </w:p>
         </w:tc>
@@ -2296,11 +2647,15 @@
             <w:pPr>
               <w:jc w:val="left"/>
               <w:rPr>
-                <w:color w:val="000000" w:themeColor="text1"/>
-              </w:rPr>
-            </w:pPr>
-            <w:r>
-              <w:rPr>
+                <w:b/>
+                <w:bCs/>
+                <w:color w:val="000000" w:themeColor="text1"/>
+              </w:rPr>
+            </w:pPr>
+            <w:r>
+              <w:rPr>
+                <w:b/>
+                <w:bCs/>
                 <w:color w:val="000000" w:themeColor="text1"/>
               </w:rPr>
               <w:t>UC-4: Add comment</w:t>
@@ -2458,7 +2813,21 @@
               <w:rPr>
                 <w:color w:val="000000" w:themeColor="text1"/>
               </w:rPr>
-              <w:t xml:space="preserve">A user wants to comment on a segment of a book, in a bookclub that they are part of. </w:t>
+              <w:t xml:space="preserve">A user wants to comment on a segment of a book, in a </w:t>
+            </w:r>
+            <w:proofErr w:type="spellStart"/>
+            <w:r>
+              <w:rPr>
+                <w:color w:val="000000" w:themeColor="text1"/>
+              </w:rPr>
+              <w:t>bookclub</w:t>
+            </w:r>
+            <w:proofErr w:type="spellEnd"/>
+            <w:r>
+              <w:rPr>
+                <w:color w:val="000000" w:themeColor="text1"/>
+              </w:rPr>
+              <w:t xml:space="preserve"> that they are part of. </w:t>
             </w:r>
           </w:p>
         </w:tc>
@@ -2584,8 +2953,16 @@
               <w:rPr>
                 <w:color w:val="000000" w:themeColor="text1"/>
               </w:rPr>
-              <w:t>PRE-2: User is part of a bookclub</w:t>
-            </w:r>
+              <w:t xml:space="preserve">PRE-2: User is part of a </w:t>
+            </w:r>
+            <w:proofErr w:type="spellStart"/>
+            <w:r>
+              <w:rPr>
+                <w:color w:val="000000" w:themeColor="text1"/>
+              </w:rPr>
+              <w:t>bookclub</w:t>
+            </w:r>
+            <w:proofErr w:type="spellEnd"/>
           </w:p>
         </w:tc>
       </w:tr>
@@ -2726,21 +3103,49 @@
               <w:rPr>
                 <w:color w:val="000000" w:themeColor="text1"/>
               </w:rPr>
-              <w:t xml:space="preserve"> a bookclub they are part of</w:t>
-            </w:r>
-          </w:p>
-          <w:p>
-            <w:pPr>
-              <w:jc w:val="left"/>
-              <w:rPr>
-                <w:color w:val="000000" w:themeColor="text1"/>
-              </w:rPr>
-            </w:pPr>
-            <w:r>
-              <w:rPr>
-                <w:color w:val="000000" w:themeColor="text1"/>
-              </w:rPr>
-              <w:t xml:space="preserve">2.        System redirects the user to the bookclub’s page. The system displays the book </w:t>
+              <w:t xml:space="preserve"> a </w:t>
+            </w:r>
+            <w:proofErr w:type="spellStart"/>
+            <w:r>
+              <w:rPr>
+                <w:color w:val="000000" w:themeColor="text1"/>
+              </w:rPr>
+              <w:t>bookclub</w:t>
+            </w:r>
+            <w:proofErr w:type="spellEnd"/>
+            <w:r>
+              <w:rPr>
+                <w:color w:val="000000" w:themeColor="text1"/>
+              </w:rPr>
+              <w:t xml:space="preserve"> they are part of</w:t>
+            </w:r>
+          </w:p>
+          <w:p>
+            <w:pPr>
+              <w:jc w:val="left"/>
+              <w:rPr>
+                <w:color w:val="000000" w:themeColor="text1"/>
+              </w:rPr>
+            </w:pPr>
+            <w:r>
+              <w:rPr>
+                <w:color w:val="000000" w:themeColor="text1"/>
+              </w:rPr>
+              <w:t xml:space="preserve">2.        System redirects the user to the </w:t>
+            </w:r>
+            <w:proofErr w:type="spellStart"/>
+            <w:r>
+              <w:rPr>
+                <w:color w:val="000000" w:themeColor="text1"/>
+              </w:rPr>
+              <w:t>bookclub’s</w:t>
+            </w:r>
+            <w:proofErr w:type="spellEnd"/>
+            <w:r>
+              <w:rPr>
+                <w:color w:val="000000" w:themeColor="text1"/>
+              </w:rPr>
+              <w:t xml:space="preserve"> page. The system displays the book </w:t>
             </w:r>
           </w:p>
           <w:p>
@@ -2788,123 +3193,123 @@
               <w:rPr>
                 <w:color w:val="000000" w:themeColor="text1"/>
               </w:rPr>
+              <w:t>5</w:t>
+            </w:r>
+            <w:r>
+              <w:rPr>
+                <w:color w:val="000000" w:themeColor="text1"/>
+              </w:rPr>
+              <w:t>. User selects a fragment of text</w:t>
+            </w:r>
+          </w:p>
+          <w:p>
+            <w:pPr>
+              <w:jc w:val="left"/>
+              <w:rPr>
+                <w:color w:val="000000" w:themeColor="text1"/>
+              </w:rPr>
+            </w:pPr>
+            <w:r>
+              <w:rPr>
+                <w:color w:val="000000" w:themeColor="text1"/>
+              </w:rPr>
+              <w:t>6</w:t>
+            </w:r>
+            <w:r>
+              <w:rPr>
+                <w:color w:val="000000" w:themeColor="text1"/>
+              </w:rPr>
+              <w:t>.         System highlights the fragment of text and prompts the user to add a comment</w:t>
+            </w:r>
+          </w:p>
+          <w:p>
+            <w:pPr>
+              <w:jc w:val="left"/>
+              <w:rPr>
+                <w:color w:val="000000" w:themeColor="text1"/>
+              </w:rPr>
+            </w:pPr>
+            <w:r>
+              <w:rPr>
+                <w:color w:val="000000" w:themeColor="text1"/>
+              </w:rPr>
+              <w:t>7</w:t>
+            </w:r>
+            <w:r>
+              <w:rPr>
+                <w:color w:val="000000" w:themeColor="text1"/>
+              </w:rPr>
+              <w:t xml:space="preserve">. User </w:t>
+            </w:r>
+            <w:r>
+              <w:rPr>
+                <w:color w:val="000000" w:themeColor="text1"/>
+              </w:rPr>
+              <w:t xml:space="preserve">chooses to </w:t>
+            </w:r>
+            <w:r>
+              <w:rPr>
+                <w:color w:val="000000" w:themeColor="text1"/>
+              </w:rPr>
+              <w:t>add</w:t>
+            </w:r>
+            <w:r>
+              <w:rPr>
+                <w:color w:val="000000" w:themeColor="text1"/>
+              </w:rPr>
+              <w:t xml:space="preserve"> a</w:t>
+            </w:r>
+            <w:r>
+              <w:rPr>
+                <w:color w:val="000000" w:themeColor="text1"/>
+              </w:rPr>
+              <w:t xml:space="preserve"> comment</w:t>
+            </w:r>
+          </w:p>
+          <w:p>
+            <w:pPr>
+              <w:jc w:val="left"/>
+              <w:rPr>
+                <w:color w:val="000000" w:themeColor="text1"/>
+              </w:rPr>
+            </w:pPr>
+            <w:r>
+              <w:rPr>
+                <w:color w:val="000000" w:themeColor="text1"/>
+              </w:rPr>
+              <w:t>8</w:t>
+            </w:r>
+            <w:r>
+              <w:rPr>
+                <w:color w:val="000000" w:themeColor="text1"/>
+              </w:rPr>
+              <w:t xml:space="preserve">.        System </w:t>
+            </w:r>
+            <w:r>
+              <w:rPr>
+                <w:color w:val="000000" w:themeColor="text1"/>
+              </w:rPr>
+              <w:t>prompts</w:t>
+            </w:r>
+            <w:r>
+              <w:rPr>
+                <w:color w:val="000000" w:themeColor="text1"/>
+              </w:rPr>
+              <w:t xml:space="preserve"> the user to input their comment</w:t>
+            </w:r>
+          </w:p>
+          <w:p>
+            <w:pPr>
+              <w:jc w:val="left"/>
+              <w:rPr>
+                <w:color w:val="000000" w:themeColor="text1"/>
+              </w:rPr>
+            </w:pPr>
+            <w:r>
+              <w:rPr>
+                <w:color w:val="000000" w:themeColor="text1"/>
+              </w:rPr>
               <w:lastRenderedPageBreak/>
-              <w:t>5</w:t>
-            </w:r>
-            <w:r>
-              <w:rPr>
-                <w:color w:val="000000" w:themeColor="text1"/>
-              </w:rPr>
-              <w:t>. User selects a fragment of text</w:t>
-            </w:r>
-          </w:p>
-          <w:p>
-            <w:pPr>
-              <w:jc w:val="left"/>
-              <w:rPr>
-                <w:color w:val="000000" w:themeColor="text1"/>
-              </w:rPr>
-            </w:pPr>
-            <w:r>
-              <w:rPr>
-                <w:color w:val="000000" w:themeColor="text1"/>
-              </w:rPr>
-              <w:t>6</w:t>
-            </w:r>
-            <w:r>
-              <w:rPr>
-                <w:color w:val="000000" w:themeColor="text1"/>
-              </w:rPr>
-              <w:t>.         System highlights the fragment of text and prompts the user to add a comment</w:t>
-            </w:r>
-          </w:p>
-          <w:p>
-            <w:pPr>
-              <w:jc w:val="left"/>
-              <w:rPr>
-                <w:color w:val="000000" w:themeColor="text1"/>
-              </w:rPr>
-            </w:pPr>
-            <w:r>
-              <w:rPr>
-                <w:color w:val="000000" w:themeColor="text1"/>
-              </w:rPr>
-              <w:t>7</w:t>
-            </w:r>
-            <w:r>
-              <w:rPr>
-                <w:color w:val="000000" w:themeColor="text1"/>
-              </w:rPr>
-              <w:t xml:space="preserve">. User </w:t>
-            </w:r>
-            <w:r>
-              <w:rPr>
-                <w:color w:val="000000" w:themeColor="text1"/>
-              </w:rPr>
-              <w:t xml:space="preserve">chooses to </w:t>
-            </w:r>
-            <w:r>
-              <w:rPr>
-                <w:color w:val="000000" w:themeColor="text1"/>
-              </w:rPr>
-              <w:t>add</w:t>
-            </w:r>
-            <w:r>
-              <w:rPr>
-                <w:color w:val="000000" w:themeColor="text1"/>
-              </w:rPr>
-              <w:t xml:space="preserve"> a</w:t>
-            </w:r>
-            <w:r>
-              <w:rPr>
-                <w:color w:val="000000" w:themeColor="text1"/>
-              </w:rPr>
-              <w:t xml:space="preserve"> comment</w:t>
-            </w:r>
-          </w:p>
-          <w:p>
-            <w:pPr>
-              <w:jc w:val="left"/>
-              <w:rPr>
-                <w:color w:val="000000" w:themeColor="text1"/>
-              </w:rPr>
-            </w:pPr>
-            <w:r>
-              <w:rPr>
-                <w:color w:val="000000" w:themeColor="text1"/>
-              </w:rPr>
-              <w:t>8</w:t>
-            </w:r>
-            <w:r>
-              <w:rPr>
-                <w:color w:val="000000" w:themeColor="text1"/>
-              </w:rPr>
-              <w:t xml:space="preserve">.        System </w:t>
-            </w:r>
-            <w:r>
-              <w:rPr>
-                <w:color w:val="000000" w:themeColor="text1"/>
-              </w:rPr>
-              <w:t>prompts</w:t>
-            </w:r>
-            <w:r>
-              <w:rPr>
-                <w:color w:val="000000" w:themeColor="text1"/>
-              </w:rPr>
-              <w:t xml:space="preserve"> the user to input their comment</w:t>
-            </w:r>
-          </w:p>
-          <w:p>
-            <w:pPr>
-              <w:jc w:val="left"/>
-              <w:rPr>
-                <w:color w:val="000000" w:themeColor="text1"/>
-              </w:rPr>
-            </w:pPr>
-            <w:r>
-              <w:rPr>
-                <w:color w:val="000000" w:themeColor="text1"/>
-              </w:rPr>
               <w:t>9</w:t>
             </w:r>
             <w:r>
@@ -2931,7 +3336,21 @@
               <w:rPr>
                 <w:color w:val="000000" w:themeColor="text1"/>
               </w:rPr>
-              <w:t>10.         System adds the comment to the bookclub, and highlights the fragment of text</w:t>
+              <w:t xml:space="preserve">10.         System adds the comment to the </w:t>
+            </w:r>
+            <w:proofErr w:type="spellStart"/>
+            <w:r>
+              <w:rPr>
+                <w:color w:val="000000" w:themeColor="text1"/>
+              </w:rPr>
+              <w:t>bookclub</w:t>
+            </w:r>
+            <w:proofErr w:type="spellEnd"/>
+            <w:r>
+              <w:rPr>
+                <w:color w:val="000000" w:themeColor="text1"/>
+              </w:rPr>
+              <w:t>, and highlights the fragment of text</w:t>
             </w:r>
             <w:r>
               <w:rPr>
@@ -2987,150 +3406,14 @@
             <w:pPr>
               <w:jc w:val="left"/>
               <w:rPr>
-                <w:b/>
-                <w:bCs/>
-                <w:color w:val="000000" w:themeColor="text1"/>
-              </w:rPr>
-            </w:pPr>
-            <w:r>
-              <w:rPr>
-                <w:b/>
-                <w:bCs/>
-                <w:color w:val="000000" w:themeColor="text1"/>
-              </w:rPr>
-              <w:t>5</w:t>
-            </w:r>
-            <w:r>
-              <w:rPr>
-                <w:b/>
-                <w:bCs/>
-                <w:color w:val="000000" w:themeColor="text1"/>
-              </w:rPr>
-              <w:t>.</w:t>
-            </w:r>
-            <w:r>
-              <w:rPr>
-                <w:b/>
-                <w:bCs/>
-                <w:color w:val="000000" w:themeColor="text1"/>
-              </w:rPr>
-              <w:t>1</w:t>
-            </w:r>
-            <w:r>
-              <w:rPr>
-                <w:b/>
-                <w:bCs/>
-                <w:color w:val="000000" w:themeColor="text1"/>
-              </w:rPr>
-              <w:t xml:space="preserve"> User clicks an existing comment</w:t>
-            </w:r>
-          </w:p>
-          <w:p>
-            <w:pPr>
-              <w:jc w:val="left"/>
-              <w:rPr>
-                <w:color w:val="000000" w:themeColor="text1"/>
-              </w:rPr>
-            </w:pPr>
-            <w:r>
-              <w:rPr>
-                <w:color w:val="000000" w:themeColor="text1"/>
-              </w:rPr>
-              <w:t xml:space="preserve">1. User </w:t>
-            </w:r>
-            <w:r>
-              <w:rPr>
-                <w:color w:val="000000" w:themeColor="text1"/>
-              </w:rPr>
-              <w:t>selects a</w:t>
-            </w:r>
-            <w:r>
-              <w:rPr>
-                <w:color w:val="000000" w:themeColor="text1"/>
-              </w:rPr>
-              <w:t xml:space="preserve"> highlighted part of text</w:t>
-            </w:r>
-          </w:p>
-          <w:p>
-            <w:pPr>
-              <w:jc w:val="left"/>
-              <w:rPr>
-                <w:color w:val="000000" w:themeColor="text1"/>
-              </w:rPr>
-            </w:pPr>
-            <w:r>
-              <w:rPr>
-                <w:color w:val="000000" w:themeColor="text1"/>
-              </w:rPr>
-              <w:t>2.          System displays the comment and the user that made the comment</w:t>
-            </w:r>
-          </w:p>
-          <w:p>
-            <w:pPr>
-              <w:jc w:val="left"/>
-              <w:rPr>
-                <w:color w:val="000000" w:themeColor="text1"/>
-              </w:rPr>
-            </w:pPr>
-            <w:r>
-              <w:rPr>
-                <w:color w:val="000000" w:themeColor="text1"/>
-              </w:rPr>
-              <w:t>3. User</w:t>
-            </w:r>
-            <w:r>
-              <w:rPr>
-                <w:color w:val="000000" w:themeColor="text1"/>
-              </w:rPr>
-              <w:t xml:space="preserve"> chooses to add a comment to the highlighted text</w:t>
-            </w:r>
-          </w:p>
-          <w:p>
-            <w:pPr>
-              <w:jc w:val="left"/>
-              <w:rPr>
-                <w:color w:val="000000" w:themeColor="text1"/>
-              </w:rPr>
-            </w:pPr>
-            <w:r>
-              <w:rPr>
-                <w:color w:val="000000" w:themeColor="text1"/>
-              </w:rPr>
-              <w:t>4.            System displays a textbox for the user to input their comment</w:t>
-            </w:r>
-          </w:p>
-          <w:p>
-            <w:pPr>
-              <w:jc w:val="left"/>
-              <w:rPr>
-                <w:color w:val="000000" w:themeColor="text1"/>
-              </w:rPr>
-            </w:pPr>
-            <w:r>
-              <w:rPr>
-                <w:color w:val="000000" w:themeColor="text1"/>
-              </w:rPr>
-              <w:t xml:space="preserve">5. User inputs the comment and </w:t>
-            </w:r>
-            <w:r>
-              <w:rPr>
-                <w:color w:val="000000" w:themeColor="text1"/>
-              </w:rPr>
-              <w:t>adds the comment</w:t>
-            </w:r>
-          </w:p>
-          <w:p>
-            <w:pPr>
-              <w:jc w:val="left"/>
-              <w:rPr>
-                <w:color w:val="000000" w:themeColor="text1"/>
-              </w:rPr>
-            </w:pPr>
-            <w:r>
-              <w:rPr>
-                <w:color w:val="000000" w:themeColor="text1"/>
-              </w:rPr>
-              <w:t xml:space="preserve">6.         System adds the comment to the bookclub, and displays it below the previous comment </w:t>
+                <w:color w:val="000000" w:themeColor="text1"/>
+              </w:rPr>
+            </w:pPr>
+            <w:r>
+              <w:rPr>
+                <w:color w:val="000000" w:themeColor="text1"/>
+              </w:rPr>
+              <w:t xml:space="preserve"> </w:t>
             </w:r>
           </w:p>
         </w:tc>
@@ -3245,14 +3528,26 @@
             <w:pPr>
               <w:jc w:val="left"/>
               <w:rPr>
-                <w:color w:val="000000" w:themeColor="text1"/>
-              </w:rPr>
-            </w:pPr>
-            <w:r>
-              <w:rPr>
-                <w:color w:val="000000" w:themeColor="text1"/>
-              </w:rPr>
-              <w:t>UC-5: Leave Bookclub</w:t>
+                <w:b/>
+                <w:bCs/>
+                <w:color w:val="000000" w:themeColor="text1"/>
+              </w:rPr>
+            </w:pPr>
+            <w:r>
+              <w:rPr>
+                <w:b/>
+                <w:bCs/>
+                <w:color w:val="000000" w:themeColor="text1"/>
+              </w:rPr>
+              <w:t xml:space="preserve">UC-5: </w:t>
+            </w:r>
+            <w:r>
+              <w:rPr>
+                <w:b/>
+                <w:bCs/>
+                <w:color w:val="000000" w:themeColor="text1"/>
+              </w:rPr>
+              <w:t>Modify Comment</w:t>
             </w:r>
           </w:p>
         </w:tc>
@@ -3407,7 +3702,21 @@
               <w:rPr>
                 <w:color w:val="000000" w:themeColor="text1"/>
               </w:rPr>
-              <w:t>A user wants to leave a bookclub they are part of</w:t>
+              <w:t xml:space="preserve">A user wants to leave a </w:t>
+            </w:r>
+            <w:proofErr w:type="spellStart"/>
+            <w:r>
+              <w:rPr>
+                <w:color w:val="000000" w:themeColor="text1"/>
+              </w:rPr>
+              <w:t>bookclub</w:t>
+            </w:r>
+            <w:proofErr w:type="spellEnd"/>
+            <w:r>
+              <w:rPr>
+                <w:color w:val="000000" w:themeColor="text1"/>
+              </w:rPr>
+              <w:t xml:space="preserve"> they are part of</w:t>
             </w:r>
           </w:p>
         </w:tc>
@@ -3463,7 +3772,21 @@
               <w:rPr>
                 <w:color w:val="000000" w:themeColor="text1"/>
               </w:rPr>
-              <w:t xml:space="preserve">User decides to leave a bookclub </w:t>
+              <w:t xml:space="preserve">User decides to leave a </w:t>
+            </w:r>
+            <w:proofErr w:type="spellStart"/>
+            <w:r>
+              <w:rPr>
+                <w:color w:val="000000" w:themeColor="text1"/>
+              </w:rPr>
+              <w:t>bookclub</w:t>
+            </w:r>
+            <w:proofErr w:type="spellEnd"/>
+            <w:r>
+              <w:rPr>
+                <w:color w:val="000000" w:themeColor="text1"/>
+              </w:rPr>
+              <w:t xml:space="preserve"> </w:t>
             </w:r>
           </w:p>
         </w:tc>
@@ -3519,21 +3842,13 @@
               <w:rPr>
                 <w:color w:val="000000" w:themeColor="text1"/>
               </w:rPr>
-              <w:t>PRE-1: User is logged in</w:t>
-            </w:r>
-          </w:p>
-          <w:p>
-            <w:pPr>
-              <w:jc w:val="left"/>
-              <w:rPr>
-                <w:color w:val="000000" w:themeColor="text1"/>
-              </w:rPr>
-            </w:pPr>
-            <w:r>
-              <w:rPr>
-                <w:color w:val="000000" w:themeColor="text1"/>
-              </w:rPr>
-              <w:t>PRE-2: User is part of a bookclub</w:t>
+              <w:t xml:space="preserve">PRE-1: User </w:t>
+            </w:r>
+            <w:r>
+              <w:rPr>
+                <w:color w:val="000000" w:themeColor="text1"/>
+              </w:rPr>
+              <w:t>made a comment</w:t>
             </w:r>
           </w:p>
         </w:tc>
@@ -3589,21 +3904,13 @@
               <w:rPr>
                 <w:color w:val="000000" w:themeColor="text1"/>
               </w:rPr>
-              <w:t>POST-1: The bookclub’s member list is updated</w:t>
-            </w:r>
-          </w:p>
-          <w:p>
-            <w:pPr>
-              <w:jc w:val="left"/>
-              <w:rPr>
-                <w:color w:val="000000" w:themeColor="text1"/>
-              </w:rPr>
-            </w:pPr>
-            <w:r>
-              <w:rPr>
-                <w:color w:val="000000" w:themeColor="text1"/>
-              </w:rPr>
-              <w:t>POST-2: The user is no longer part of the bookclub</w:t>
+              <w:t xml:space="preserve">POST-1: </w:t>
+            </w:r>
+            <w:r>
+              <w:rPr>
+                <w:color w:val="000000" w:themeColor="text1"/>
+              </w:rPr>
+              <w:t>The comment is modified</w:t>
             </w:r>
           </w:p>
         </w:tc>
@@ -3633,7 +3940,6 @@
               <w:rPr>
                 <w:color w:val="000000" w:themeColor="text1"/>
               </w:rPr>
-              <w:lastRenderedPageBreak/>
               <w:t>Normal flow</w:t>
             </w:r>
           </w:p>
@@ -3664,7 +3970,15 @@
                 <w:bCs/>
                 <w:color w:val="000000" w:themeColor="text1"/>
               </w:rPr>
-              <w:t>1.0 User leaves bookclub</w:t>
+              <w:t xml:space="preserve">1.0 User </w:t>
+            </w:r>
+            <w:r>
+              <w:rPr>
+                <w:b/>
+                <w:bCs/>
+                <w:color w:val="000000" w:themeColor="text1"/>
+              </w:rPr>
+              <w:t>modifies comment</w:t>
             </w:r>
           </w:p>
           <w:p>
@@ -3683,7 +3997,13 @@
               <w:rPr>
                 <w:color w:val="000000" w:themeColor="text1"/>
               </w:rPr>
-              <w:t>User chooses to leave the bookclub</w:t>
+              <w:t xml:space="preserve">User chooses </w:t>
+            </w:r>
+            <w:r>
+              <w:rPr>
+                <w:color w:val="000000" w:themeColor="text1"/>
+              </w:rPr>
+              <w:t>to modifies their comment</w:t>
             </w:r>
           </w:p>
           <w:p>
@@ -3702,7 +4022,13 @@
               <w:rPr>
                 <w:color w:val="000000" w:themeColor="text1"/>
               </w:rPr>
-              <w:t xml:space="preserve">        System prompts the user to confirm leaving</w:t>
+              <w:t xml:space="preserve">        System prompts the user to </w:t>
+            </w:r>
+            <w:r>
+              <w:rPr>
+                <w:color w:val="000000" w:themeColor="text1"/>
+              </w:rPr>
+              <w:t>input the modifications</w:t>
             </w:r>
           </w:p>
           <w:p>
@@ -3740,7 +4066,13 @@
               <w:rPr>
                 <w:color w:val="000000" w:themeColor="text1"/>
               </w:rPr>
-              <w:t xml:space="preserve">        System removes the user from the bookclub, updates the bookclub’s list of users and redirects the user to the main page</w:t>
+              <w:t xml:space="preserve">        System </w:t>
+            </w:r>
+            <w:r>
+              <w:rPr>
+                <w:color w:val="000000" w:themeColor="text1"/>
+              </w:rPr>
+              <w:t>modifies the comment</w:t>
             </w:r>
           </w:p>
           <w:p>
@@ -3800,54 +4132,6 @@
                 <w:color w:val="000000" w:themeColor="text1"/>
               </w:rPr>
             </w:pPr>
-            <w:r>
-              <w:rPr>
-                <w:color w:val="000000" w:themeColor="text1"/>
-              </w:rPr>
-              <w:t xml:space="preserve">3.  </w:t>
-            </w:r>
-            <w:r>
-              <w:rPr>
-                <w:b/>
-                <w:bCs/>
-                <w:color w:val="000000" w:themeColor="text1"/>
-              </w:rPr>
-              <w:t>User doesn’t confirm</w:t>
-            </w:r>
-            <w:r>
-              <w:rPr>
-                <w:color w:val="000000" w:themeColor="text1"/>
-              </w:rPr>
-              <w:t xml:space="preserve"> </w:t>
-            </w:r>
-          </w:p>
-          <w:p>
-            <w:pPr>
-              <w:jc w:val="left"/>
-              <w:rPr>
-                <w:color w:val="000000" w:themeColor="text1"/>
-              </w:rPr>
-            </w:pPr>
-            <w:r>
-              <w:rPr>
-                <w:color w:val="000000" w:themeColor="text1"/>
-              </w:rPr>
-              <w:t xml:space="preserve">        1. User selects to not leave the bookclub</w:t>
-            </w:r>
-          </w:p>
-          <w:p>
-            <w:pPr>
-              <w:jc w:val="left"/>
-              <w:rPr>
-                <w:color w:val="000000" w:themeColor="text1"/>
-              </w:rPr>
-            </w:pPr>
-            <w:r>
-              <w:rPr>
-                <w:color w:val="000000" w:themeColor="text1"/>
-              </w:rPr>
-              <w:t xml:space="preserve">        2.         System redirects the user to the bookclub’s main page</w:t>
-            </w:r>
           </w:p>
         </w:tc>
       </w:tr>
@@ -3898,6 +4182,1498 @@
                 <w:color w:val="000000" w:themeColor="text1"/>
               </w:rPr>
             </w:pPr>
+          </w:p>
+        </w:tc>
+      </w:tr>
+    </w:tbl>
+    <w:p/>
+    <w:tbl>
+      <w:tblPr>
+        <w:tblStyle w:val="TableGrid"/>
+        <w:tblW w:w="0" w:type="auto"/>
+        <w:tblLayout w:type="fixed"/>
+        <w:tblLook w:val="0000" w:firstRow="0" w:lastRow="0" w:firstColumn="0" w:lastColumn="0" w:noHBand="0" w:noVBand="0"/>
+      </w:tblPr>
+      <w:tblGrid>
+        <w:gridCol w:w="2340"/>
+        <w:gridCol w:w="2340"/>
+        <w:gridCol w:w="2340"/>
+        <w:gridCol w:w="2340"/>
+      </w:tblGrid>
+      <w:tr>
+        <w:trPr>
+          <w:trHeight w:val="405"/>
+        </w:trPr>
+        <w:tc>
+          <w:tcPr>
+            <w:tcW w:w="2340" w:type="dxa"/>
+            <w:tcBorders>
+              <w:top w:val="single" w:sz="6" w:space="0" w:color="000000" w:themeColor="text1"/>
+              <w:left w:val="single" w:sz="6" w:space="0" w:color="000000" w:themeColor="text1"/>
+              <w:bottom w:val="single" w:sz="6" w:space="0" w:color="000000" w:themeColor="text1"/>
+              <w:right w:val="single" w:sz="6" w:space="0" w:color="000000" w:themeColor="text1"/>
+            </w:tcBorders>
+          </w:tcPr>
+          <w:p>
+            <w:pPr>
+              <w:jc w:val="left"/>
+              <w:rPr>
+                <w:color w:val="000000" w:themeColor="text1"/>
+              </w:rPr>
+            </w:pPr>
+            <w:r>
+              <w:rPr>
+                <w:color w:val="000000" w:themeColor="text1"/>
+              </w:rPr>
+              <w:t>ID and name</w:t>
+            </w:r>
+          </w:p>
+        </w:tc>
+        <w:tc>
+          <w:tcPr>
+            <w:tcW w:w="7020" w:type="dxa"/>
+            <w:gridSpan w:val="3"/>
+            <w:tcBorders>
+              <w:top w:val="single" w:sz="6" w:space="0" w:color="000000" w:themeColor="text1"/>
+              <w:left w:val="single" w:sz="6" w:space="0" w:color="000000" w:themeColor="text1"/>
+              <w:bottom w:val="single" w:sz="6" w:space="0" w:color="000000" w:themeColor="text1"/>
+              <w:right w:val="single" w:sz="6" w:space="0" w:color="000000" w:themeColor="text1"/>
+            </w:tcBorders>
+          </w:tcPr>
+          <w:p>
+            <w:pPr>
+              <w:jc w:val="left"/>
+              <w:rPr>
+                <w:b/>
+                <w:bCs/>
+                <w:color w:val="000000" w:themeColor="text1"/>
+              </w:rPr>
+            </w:pPr>
+            <w:r>
+              <w:rPr>
+                <w:b/>
+                <w:bCs/>
+                <w:color w:val="000000" w:themeColor="text1"/>
+              </w:rPr>
+              <w:t>UC-</w:t>
+            </w:r>
+            <w:r>
+              <w:rPr>
+                <w:b/>
+                <w:bCs/>
+                <w:color w:val="000000" w:themeColor="text1"/>
+              </w:rPr>
+              <w:t>6</w:t>
+            </w:r>
+            <w:r>
+              <w:rPr>
+                <w:b/>
+                <w:bCs/>
+                <w:color w:val="000000" w:themeColor="text1"/>
+              </w:rPr>
+              <w:t xml:space="preserve">: </w:t>
+            </w:r>
+            <w:r>
+              <w:rPr>
+                <w:b/>
+                <w:bCs/>
+                <w:color w:val="000000" w:themeColor="text1"/>
+              </w:rPr>
+              <w:t>Delete</w:t>
+            </w:r>
+            <w:r>
+              <w:rPr>
+                <w:b/>
+                <w:bCs/>
+                <w:color w:val="000000" w:themeColor="text1"/>
+              </w:rPr>
+              <w:t xml:space="preserve"> Comment</w:t>
+            </w:r>
+          </w:p>
+        </w:tc>
+      </w:tr>
+      <w:tr>
+        <w:trPr>
+          <w:trHeight w:val="600"/>
+        </w:trPr>
+        <w:tc>
+          <w:tcPr>
+            <w:tcW w:w="2340" w:type="dxa"/>
+            <w:tcBorders>
+              <w:top w:val="single" w:sz="6" w:space="0" w:color="000000" w:themeColor="text1"/>
+              <w:left w:val="single" w:sz="6" w:space="0" w:color="000000" w:themeColor="text1"/>
+              <w:bottom w:val="single" w:sz="6" w:space="0" w:color="000000" w:themeColor="text1"/>
+              <w:right w:val="single" w:sz="6" w:space="0" w:color="000000" w:themeColor="text1"/>
+            </w:tcBorders>
+          </w:tcPr>
+          <w:p>
+            <w:pPr>
+              <w:jc w:val="left"/>
+              <w:rPr>
+                <w:color w:val="000000" w:themeColor="text1"/>
+              </w:rPr>
+            </w:pPr>
+            <w:r>
+              <w:rPr>
+                <w:color w:val="000000" w:themeColor="text1"/>
+              </w:rPr>
+              <w:t>Primary actor</w:t>
+            </w:r>
+          </w:p>
+        </w:tc>
+        <w:tc>
+          <w:tcPr>
+            <w:tcW w:w="2340" w:type="dxa"/>
+            <w:tcBorders>
+              <w:top w:val="single" w:sz="6" w:space="0" w:color="000000" w:themeColor="text1"/>
+              <w:left w:val="single" w:sz="6" w:space="0" w:color="000000" w:themeColor="text1"/>
+              <w:bottom w:val="single" w:sz="6" w:space="0" w:color="000000" w:themeColor="text1"/>
+              <w:right w:val="single" w:sz="6" w:space="0" w:color="000000" w:themeColor="text1"/>
+            </w:tcBorders>
+          </w:tcPr>
+          <w:p>
+            <w:pPr>
+              <w:jc w:val="left"/>
+              <w:rPr>
+                <w:color w:val="000000" w:themeColor="text1"/>
+              </w:rPr>
+            </w:pPr>
+            <w:r>
+              <w:rPr>
+                <w:color w:val="000000" w:themeColor="text1"/>
+              </w:rPr>
+              <w:t>User</w:t>
+            </w:r>
+          </w:p>
+        </w:tc>
+        <w:tc>
+          <w:tcPr>
+            <w:tcW w:w="2340" w:type="dxa"/>
+            <w:tcBorders>
+              <w:top w:val="single" w:sz="6" w:space="0" w:color="000000" w:themeColor="text1"/>
+              <w:left w:val="single" w:sz="6" w:space="0" w:color="000000" w:themeColor="text1"/>
+              <w:bottom w:val="single" w:sz="6" w:space="0" w:color="000000" w:themeColor="text1"/>
+              <w:right w:val="single" w:sz="6" w:space="0" w:color="000000" w:themeColor="text1"/>
+            </w:tcBorders>
+          </w:tcPr>
+          <w:p>
+            <w:pPr>
+              <w:jc w:val="left"/>
+              <w:rPr>
+                <w:color w:val="000000" w:themeColor="text1"/>
+              </w:rPr>
+            </w:pPr>
+            <w:r>
+              <w:rPr>
+                <w:color w:val="000000" w:themeColor="text1"/>
+              </w:rPr>
+              <w:t>Secondary actors</w:t>
+            </w:r>
+          </w:p>
+        </w:tc>
+        <w:tc>
+          <w:tcPr>
+            <w:tcW w:w="2340" w:type="dxa"/>
+            <w:tcBorders>
+              <w:top w:val="single" w:sz="6" w:space="0" w:color="000000" w:themeColor="text1"/>
+              <w:left w:val="single" w:sz="6" w:space="0" w:color="000000" w:themeColor="text1"/>
+              <w:bottom w:val="single" w:sz="6" w:space="0" w:color="000000" w:themeColor="text1"/>
+              <w:right w:val="single" w:sz="6" w:space="0" w:color="000000" w:themeColor="text1"/>
+            </w:tcBorders>
+          </w:tcPr>
+          <w:p>
+            <w:pPr>
+              <w:jc w:val="left"/>
+              <w:rPr>
+                <w:color w:val="000000" w:themeColor="text1"/>
+              </w:rPr>
+            </w:pPr>
+          </w:p>
+        </w:tc>
+      </w:tr>
+      <w:tr>
+        <w:trPr>
+          <w:trHeight w:val="405"/>
+        </w:trPr>
+        <w:tc>
+          <w:tcPr>
+            <w:tcW w:w="2340" w:type="dxa"/>
+            <w:tcBorders>
+              <w:top w:val="single" w:sz="6" w:space="0" w:color="000000" w:themeColor="text1"/>
+              <w:left w:val="single" w:sz="6" w:space="0" w:color="000000" w:themeColor="text1"/>
+              <w:bottom w:val="single" w:sz="6" w:space="0" w:color="000000" w:themeColor="text1"/>
+              <w:right w:val="single" w:sz="6" w:space="0" w:color="000000" w:themeColor="text1"/>
+            </w:tcBorders>
+          </w:tcPr>
+          <w:p>
+            <w:pPr>
+              <w:jc w:val="left"/>
+              <w:rPr>
+                <w:color w:val="000000" w:themeColor="text1"/>
+              </w:rPr>
+            </w:pPr>
+            <w:r>
+              <w:rPr>
+                <w:color w:val="000000" w:themeColor="text1"/>
+              </w:rPr>
+              <w:t>Description</w:t>
+            </w:r>
+          </w:p>
+        </w:tc>
+        <w:tc>
+          <w:tcPr>
+            <w:tcW w:w="7020" w:type="dxa"/>
+            <w:gridSpan w:val="3"/>
+            <w:tcBorders>
+              <w:top w:val="single" w:sz="6" w:space="0" w:color="000000" w:themeColor="text1"/>
+              <w:left w:val="single" w:sz="6" w:space="0" w:color="000000" w:themeColor="text1"/>
+              <w:bottom w:val="single" w:sz="6" w:space="0" w:color="000000" w:themeColor="text1"/>
+              <w:right w:val="single" w:sz="6" w:space="0" w:color="000000" w:themeColor="text1"/>
+            </w:tcBorders>
+          </w:tcPr>
+          <w:p>
+            <w:pPr>
+              <w:jc w:val="left"/>
+              <w:rPr>
+                <w:color w:val="000000" w:themeColor="text1"/>
+              </w:rPr>
+            </w:pPr>
+            <w:r>
+              <w:rPr>
+                <w:color w:val="000000" w:themeColor="text1"/>
+              </w:rPr>
+              <w:t xml:space="preserve">A user wants to </w:t>
+            </w:r>
+            <w:r>
+              <w:rPr>
+                <w:color w:val="000000" w:themeColor="text1"/>
+              </w:rPr>
+              <w:t>delete a comment they made</w:t>
+            </w:r>
+          </w:p>
+        </w:tc>
+      </w:tr>
+      <w:tr>
+        <w:trPr>
+          <w:trHeight w:val="405"/>
+        </w:trPr>
+        <w:tc>
+          <w:tcPr>
+            <w:tcW w:w="2340" w:type="dxa"/>
+            <w:tcBorders>
+              <w:top w:val="single" w:sz="6" w:space="0" w:color="000000" w:themeColor="text1"/>
+              <w:left w:val="single" w:sz="6" w:space="0" w:color="000000" w:themeColor="text1"/>
+              <w:bottom w:val="single" w:sz="6" w:space="0" w:color="000000" w:themeColor="text1"/>
+              <w:right w:val="single" w:sz="6" w:space="0" w:color="000000" w:themeColor="text1"/>
+            </w:tcBorders>
+          </w:tcPr>
+          <w:p>
+            <w:pPr>
+              <w:jc w:val="left"/>
+              <w:rPr>
+                <w:color w:val="000000" w:themeColor="text1"/>
+              </w:rPr>
+            </w:pPr>
+            <w:r>
+              <w:rPr>
+                <w:color w:val="000000" w:themeColor="text1"/>
+              </w:rPr>
+              <w:t>Trigger</w:t>
+            </w:r>
+          </w:p>
+        </w:tc>
+        <w:tc>
+          <w:tcPr>
+            <w:tcW w:w="7020" w:type="dxa"/>
+            <w:gridSpan w:val="3"/>
+            <w:tcBorders>
+              <w:top w:val="single" w:sz="6" w:space="0" w:color="000000" w:themeColor="text1"/>
+              <w:left w:val="single" w:sz="6" w:space="0" w:color="000000" w:themeColor="text1"/>
+              <w:bottom w:val="single" w:sz="6" w:space="0" w:color="000000" w:themeColor="text1"/>
+              <w:right w:val="single" w:sz="6" w:space="0" w:color="000000" w:themeColor="text1"/>
+            </w:tcBorders>
+          </w:tcPr>
+          <w:p>
+            <w:pPr>
+              <w:jc w:val="left"/>
+              <w:rPr>
+                <w:color w:val="000000" w:themeColor="text1"/>
+              </w:rPr>
+            </w:pPr>
+            <w:r>
+              <w:rPr>
+                <w:color w:val="000000" w:themeColor="text1"/>
+              </w:rPr>
+              <w:t xml:space="preserve">User </w:t>
+            </w:r>
+            <w:r>
+              <w:rPr>
+                <w:color w:val="000000" w:themeColor="text1"/>
+              </w:rPr>
+              <w:t>decides to delete their comment</w:t>
+            </w:r>
+          </w:p>
+        </w:tc>
+      </w:tr>
+      <w:tr>
+        <w:trPr>
+          <w:trHeight w:val="405"/>
+        </w:trPr>
+        <w:tc>
+          <w:tcPr>
+            <w:tcW w:w="2340" w:type="dxa"/>
+            <w:tcBorders>
+              <w:top w:val="single" w:sz="6" w:space="0" w:color="000000" w:themeColor="text1"/>
+              <w:left w:val="single" w:sz="6" w:space="0" w:color="000000" w:themeColor="text1"/>
+              <w:bottom w:val="single" w:sz="6" w:space="0" w:color="000000" w:themeColor="text1"/>
+              <w:right w:val="single" w:sz="6" w:space="0" w:color="000000" w:themeColor="text1"/>
+            </w:tcBorders>
+          </w:tcPr>
+          <w:p>
+            <w:pPr>
+              <w:jc w:val="left"/>
+              <w:rPr>
+                <w:color w:val="000000" w:themeColor="text1"/>
+              </w:rPr>
+            </w:pPr>
+            <w:r>
+              <w:rPr>
+                <w:color w:val="000000" w:themeColor="text1"/>
+              </w:rPr>
+              <w:t>Preconditions</w:t>
+            </w:r>
+          </w:p>
+        </w:tc>
+        <w:tc>
+          <w:tcPr>
+            <w:tcW w:w="7020" w:type="dxa"/>
+            <w:gridSpan w:val="3"/>
+            <w:tcBorders>
+              <w:top w:val="single" w:sz="6" w:space="0" w:color="000000" w:themeColor="text1"/>
+              <w:left w:val="single" w:sz="6" w:space="0" w:color="000000" w:themeColor="text1"/>
+              <w:bottom w:val="single" w:sz="6" w:space="0" w:color="000000" w:themeColor="text1"/>
+              <w:right w:val="single" w:sz="6" w:space="0" w:color="000000" w:themeColor="text1"/>
+            </w:tcBorders>
+          </w:tcPr>
+          <w:p>
+            <w:pPr>
+              <w:jc w:val="left"/>
+              <w:rPr>
+                <w:color w:val="000000" w:themeColor="text1"/>
+              </w:rPr>
+            </w:pPr>
+            <w:r>
+              <w:rPr>
+                <w:color w:val="000000" w:themeColor="text1"/>
+              </w:rPr>
+              <w:t>PRE-1: User made a comment</w:t>
+            </w:r>
+          </w:p>
+        </w:tc>
+      </w:tr>
+      <w:tr>
+        <w:trPr>
+          <w:trHeight w:val="405"/>
+        </w:trPr>
+        <w:tc>
+          <w:tcPr>
+            <w:tcW w:w="2340" w:type="dxa"/>
+            <w:tcBorders>
+              <w:top w:val="single" w:sz="6" w:space="0" w:color="000000" w:themeColor="text1"/>
+              <w:left w:val="single" w:sz="6" w:space="0" w:color="000000" w:themeColor="text1"/>
+              <w:bottom w:val="single" w:sz="6" w:space="0" w:color="000000" w:themeColor="text1"/>
+              <w:right w:val="single" w:sz="6" w:space="0" w:color="000000" w:themeColor="text1"/>
+            </w:tcBorders>
+          </w:tcPr>
+          <w:p>
+            <w:pPr>
+              <w:jc w:val="left"/>
+              <w:rPr>
+                <w:color w:val="000000" w:themeColor="text1"/>
+              </w:rPr>
+            </w:pPr>
+            <w:r>
+              <w:rPr>
+                <w:color w:val="000000" w:themeColor="text1"/>
+              </w:rPr>
+              <w:t>Postconditions</w:t>
+            </w:r>
+          </w:p>
+        </w:tc>
+        <w:tc>
+          <w:tcPr>
+            <w:tcW w:w="7020" w:type="dxa"/>
+            <w:gridSpan w:val="3"/>
+            <w:tcBorders>
+              <w:top w:val="single" w:sz="6" w:space="0" w:color="000000" w:themeColor="text1"/>
+              <w:left w:val="single" w:sz="6" w:space="0" w:color="000000" w:themeColor="text1"/>
+              <w:bottom w:val="single" w:sz="6" w:space="0" w:color="000000" w:themeColor="text1"/>
+              <w:right w:val="single" w:sz="6" w:space="0" w:color="000000" w:themeColor="text1"/>
+            </w:tcBorders>
+          </w:tcPr>
+          <w:p>
+            <w:pPr>
+              <w:jc w:val="left"/>
+              <w:rPr>
+                <w:color w:val="000000" w:themeColor="text1"/>
+              </w:rPr>
+            </w:pPr>
+            <w:r>
+              <w:rPr>
+                <w:color w:val="000000" w:themeColor="text1"/>
+              </w:rPr>
+              <w:t xml:space="preserve">POST-1: The comment is </w:t>
+            </w:r>
+            <w:r>
+              <w:rPr>
+                <w:color w:val="000000" w:themeColor="text1"/>
+              </w:rPr>
+              <w:t>deleted</w:t>
+            </w:r>
+          </w:p>
+        </w:tc>
+      </w:tr>
+      <w:tr>
+        <w:trPr>
+          <w:trHeight w:val="405"/>
+        </w:trPr>
+        <w:tc>
+          <w:tcPr>
+            <w:tcW w:w="2340" w:type="dxa"/>
+            <w:tcBorders>
+              <w:top w:val="single" w:sz="6" w:space="0" w:color="000000" w:themeColor="text1"/>
+              <w:left w:val="single" w:sz="6" w:space="0" w:color="000000" w:themeColor="text1"/>
+              <w:bottom w:val="single" w:sz="6" w:space="0" w:color="000000" w:themeColor="text1"/>
+              <w:right w:val="single" w:sz="6" w:space="0" w:color="000000" w:themeColor="text1"/>
+            </w:tcBorders>
+          </w:tcPr>
+          <w:p>
+            <w:pPr>
+              <w:jc w:val="left"/>
+              <w:rPr>
+                <w:color w:val="000000" w:themeColor="text1"/>
+              </w:rPr>
+            </w:pPr>
+            <w:r>
+              <w:rPr>
+                <w:color w:val="000000" w:themeColor="text1"/>
+              </w:rPr>
+              <w:lastRenderedPageBreak/>
+              <w:t>Normal flow</w:t>
+            </w:r>
+          </w:p>
+        </w:tc>
+        <w:tc>
+          <w:tcPr>
+            <w:tcW w:w="7020" w:type="dxa"/>
+            <w:gridSpan w:val="3"/>
+            <w:tcBorders>
+              <w:top w:val="single" w:sz="6" w:space="0" w:color="000000" w:themeColor="text1"/>
+              <w:left w:val="single" w:sz="6" w:space="0" w:color="000000" w:themeColor="text1"/>
+              <w:bottom w:val="single" w:sz="6" w:space="0" w:color="000000" w:themeColor="text1"/>
+              <w:right w:val="single" w:sz="6" w:space="0" w:color="000000" w:themeColor="text1"/>
+            </w:tcBorders>
+          </w:tcPr>
+          <w:p>
+            <w:pPr>
+              <w:jc w:val="left"/>
+              <w:rPr>
+                <w:b/>
+                <w:bCs/>
+                <w:color w:val="000000" w:themeColor="text1"/>
+              </w:rPr>
+            </w:pPr>
+            <w:r>
+              <w:rPr>
+                <w:b/>
+                <w:bCs/>
+                <w:color w:val="000000" w:themeColor="text1"/>
+              </w:rPr>
+              <w:t xml:space="preserve">1.0 User </w:t>
+            </w:r>
+            <w:r>
+              <w:rPr>
+                <w:b/>
+                <w:bCs/>
+                <w:color w:val="000000" w:themeColor="text1"/>
+              </w:rPr>
+              <w:t>deletes</w:t>
+            </w:r>
+            <w:r>
+              <w:rPr>
+                <w:b/>
+                <w:bCs/>
+                <w:color w:val="000000" w:themeColor="text1"/>
+              </w:rPr>
+              <w:t xml:space="preserve"> comment</w:t>
+            </w:r>
+          </w:p>
+          <w:p>
+            <w:pPr>
+              <w:pStyle w:val="ListParagraph"/>
+              <w:numPr>
+                <w:ilvl w:val="0"/>
+                <w:numId w:val="21"/>
+              </w:numPr>
+              <w:jc w:val="left"/>
+              <w:rPr>
+                <w:color w:val="000000" w:themeColor="text1"/>
+              </w:rPr>
+            </w:pPr>
+            <w:r>
+              <w:rPr>
+                <w:color w:val="000000" w:themeColor="text1"/>
+              </w:rPr>
+              <w:t xml:space="preserve">User chooses to </w:t>
+            </w:r>
+            <w:r>
+              <w:rPr>
+                <w:color w:val="000000" w:themeColor="text1"/>
+              </w:rPr>
+              <w:t>delete</w:t>
+            </w:r>
+            <w:r>
+              <w:rPr>
+                <w:color w:val="000000" w:themeColor="text1"/>
+              </w:rPr>
+              <w:t xml:space="preserve"> their comment</w:t>
+            </w:r>
+          </w:p>
+          <w:p>
+            <w:pPr>
+              <w:pStyle w:val="ListParagraph"/>
+              <w:numPr>
+                <w:ilvl w:val="0"/>
+                <w:numId w:val="21"/>
+              </w:numPr>
+              <w:jc w:val="left"/>
+              <w:rPr>
+                <w:color w:val="000000" w:themeColor="text1"/>
+              </w:rPr>
+            </w:pPr>
+            <w:r>
+              <w:rPr>
+                <w:color w:val="000000" w:themeColor="text1"/>
+              </w:rPr>
+              <w:t xml:space="preserve">        System </w:t>
+            </w:r>
+            <w:r>
+              <w:rPr>
+                <w:color w:val="000000" w:themeColor="text1"/>
+              </w:rPr>
+              <w:t>asks the user for confirmation</w:t>
+            </w:r>
+          </w:p>
+          <w:p>
+            <w:pPr>
+              <w:pStyle w:val="ListParagraph"/>
+              <w:numPr>
+                <w:ilvl w:val="0"/>
+                <w:numId w:val="21"/>
+              </w:numPr>
+              <w:jc w:val="left"/>
+              <w:rPr>
+                <w:color w:val="000000" w:themeColor="text1"/>
+              </w:rPr>
+            </w:pPr>
+            <w:r>
+              <w:rPr>
+                <w:color w:val="000000" w:themeColor="text1"/>
+              </w:rPr>
+              <w:t>User confirms</w:t>
+            </w:r>
+          </w:p>
+          <w:p>
+            <w:pPr>
+              <w:pStyle w:val="ListParagraph"/>
+              <w:numPr>
+                <w:ilvl w:val="0"/>
+                <w:numId w:val="21"/>
+              </w:numPr>
+              <w:jc w:val="left"/>
+              <w:rPr>
+                <w:color w:val="000000" w:themeColor="text1"/>
+              </w:rPr>
+            </w:pPr>
+            <w:r>
+              <w:rPr>
+                <w:color w:val="000000" w:themeColor="text1"/>
+              </w:rPr>
+              <w:t xml:space="preserve">        System </w:t>
+            </w:r>
+            <w:r>
+              <w:rPr>
+                <w:color w:val="000000" w:themeColor="text1"/>
+              </w:rPr>
+              <w:t>deletes the comment</w:t>
+            </w:r>
+          </w:p>
+          <w:p>
+            <w:pPr>
+              <w:jc w:val="left"/>
+              <w:rPr>
+                <w:color w:val="000000" w:themeColor="text1"/>
+              </w:rPr>
+            </w:pPr>
+          </w:p>
+        </w:tc>
+      </w:tr>
+      <w:tr>
+        <w:trPr>
+          <w:trHeight w:val="405"/>
+        </w:trPr>
+        <w:tc>
+          <w:tcPr>
+            <w:tcW w:w="2340" w:type="dxa"/>
+            <w:tcBorders>
+              <w:top w:val="single" w:sz="6" w:space="0" w:color="000000" w:themeColor="text1"/>
+              <w:left w:val="single" w:sz="6" w:space="0" w:color="000000" w:themeColor="text1"/>
+              <w:bottom w:val="single" w:sz="6" w:space="0" w:color="000000" w:themeColor="text1"/>
+              <w:right w:val="single" w:sz="6" w:space="0" w:color="000000" w:themeColor="text1"/>
+            </w:tcBorders>
+          </w:tcPr>
+          <w:p>
+            <w:pPr>
+              <w:jc w:val="left"/>
+              <w:rPr>
+                <w:color w:val="000000" w:themeColor="text1"/>
+              </w:rPr>
+            </w:pPr>
+            <w:r>
+              <w:rPr>
+                <w:color w:val="000000" w:themeColor="text1"/>
+              </w:rPr>
+              <w:t>Alternative flows</w:t>
+            </w:r>
+          </w:p>
+        </w:tc>
+        <w:tc>
+          <w:tcPr>
+            <w:tcW w:w="7020" w:type="dxa"/>
+            <w:gridSpan w:val="3"/>
+            <w:tcBorders>
+              <w:top w:val="single" w:sz="6" w:space="0" w:color="000000" w:themeColor="text1"/>
+              <w:left w:val="single" w:sz="6" w:space="0" w:color="000000" w:themeColor="text1"/>
+              <w:bottom w:val="single" w:sz="6" w:space="0" w:color="000000" w:themeColor="text1"/>
+              <w:right w:val="single" w:sz="6" w:space="0" w:color="000000" w:themeColor="text1"/>
+            </w:tcBorders>
+          </w:tcPr>
+          <w:p>
+            <w:pPr>
+              <w:pStyle w:val="ListParagraph"/>
+              <w:numPr>
+                <w:ilvl w:val="1"/>
+                <w:numId w:val="16"/>
+              </w:numPr>
+              <w:jc w:val="left"/>
+              <w:rPr>
+                <w:color w:val="000000" w:themeColor="text1"/>
+              </w:rPr>
+            </w:pPr>
+            <w:r>
+              <w:rPr>
+                <w:color w:val="000000" w:themeColor="text1"/>
+              </w:rPr>
+              <w:t>User does not confirm</w:t>
+            </w:r>
+          </w:p>
+          <w:p>
+            <w:pPr>
+              <w:pStyle w:val="ListParagraph"/>
+              <w:numPr>
+                <w:ilvl w:val="0"/>
+                <w:numId w:val="16"/>
+              </w:numPr>
+              <w:jc w:val="left"/>
+              <w:rPr>
+                <w:color w:val="000000" w:themeColor="text1"/>
+              </w:rPr>
+            </w:pPr>
+            <w:r>
+              <w:rPr>
+                <w:color w:val="000000" w:themeColor="text1"/>
+              </w:rPr>
+              <w:t>System redirects the user to the pervious page</w:t>
+            </w:r>
+          </w:p>
+        </w:tc>
+      </w:tr>
+      <w:tr>
+        <w:trPr>
+          <w:trHeight w:val="405"/>
+        </w:trPr>
+        <w:tc>
+          <w:tcPr>
+            <w:tcW w:w="2340" w:type="dxa"/>
+            <w:tcBorders>
+              <w:top w:val="single" w:sz="6" w:space="0" w:color="000000" w:themeColor="text1"/>
+              <w:left w:val="single" w:sz="6" w:space="0" w:color="000000" w:themeColor="text1"/>
+              <w:bottom w:val="single" w:sz="6" w:space="0" w:color="000000" w:themeColor="text1"/>
+              <w:right w:val="single" w:sz="6" w:space="0" w:color="000000" w:themeColor="text1"/>
+            </w:tcBorders>
+          </w:tcPr>
+          <w:p>
+            <w:pPr>
+              <w:jc w:val="left"/>
+              <w:rPr>
+                <w:color w:val="000000" w:themeColor="text1"/>
+              </w:rPr>
+            </w:pPr>
+            <w:r>
+              <w:rPr>
+                <w:color w:val="000000" w:themeColor="text1"/>
+              </w:rPr>
+              <w:t>Exceptions</w:t>
+            </w:r>
+          </w:p>
+        </w:tc>
+        <w:tc>
+          <w:tcPr>
+            <w:tcW w:w="7020" w:type="dxa"/>
+            <w:gridSpan w:val="3"/>
+            <w:tcBorders>
+              <w:top w:val="single" w:sz="6" w:space="0" w:color="000000" w:themeColor="text1"/>
+              <w:left w:val="single" w:sz="6" w:space="0" w:color="000000" w:themeColor="text1"/>
+              <w:bottom w:val="single" w:sz="6" w:space="0" w:color="000000" w:themeColor="text1"/>
+              <w:right w:val="single" w:sz="6" w:space="0" w:color="000000" w:themeColor="text1"/>
+            </w:tcBorders>
+          </w:tcPr>
+          <w:p>
+            <w:pPr>
+              <w:jc w:val="left"/>
+              <w:rPr>
+                <w:color w:val="000000" w:themeColor="text1"/>
+              </w:rPr>
+            </w:pPr>
+          </w:p>
+        </w:tc>
+      </w:tr>
+    </w:tbl>
+    <w:p/>
+    <w:p/>
+    <w:tbl>
+      <w:tblPr>
+        <w:tblStyle w:val="TableGrid"/>
+        <w:tblW w:w="0" w:type="auto"/>
+        <w:tblLayout w:type="fixed"/>
+        <w:tblLook w:val="0000" w:firstRow="0" w:lastRow="0" w:firstColumn="0" w:lastColumn="0" w:noHBand="0" w:noVBand="0"/>
+      </w:tblPr>
+      <w:tblGrid>
+        <w:gridCol w:w="2340"/>
+        <w:gridCol w:w="2340"/>
+        <w:gridCol w:w="2340"/>
+        <w:gridCol w:w="2340"/>
+      </w:tblGrid>
+      <w:tr>
+        <w:trPr>
+          <w:trHeight w:val="405"/>
+        </w:trPr>
+        <w:tc>
+          <w:tcPr>
+            <w:tcW w:w="2340" w:type="dxa"/>
+            <w:tcBorders>
+              <w:top w:val="single" w:sz="6" w:space="0" w:color="000000" w:themeColor="text1"/>
+              <w:left w:val="single" w:sz="6" w:space="0" w:color="000000" w:themeColor="text1"/>
+              <w:bottom w:val="single" w:sz="6" w:space="0" w:color="000000" w:themeColor="text1"/>
+              <w:right w:val="single" w:sz="6" w:space="0" w:color="000000" w:themeColor="text1"/>
+            </w:tcBorders>
+          </w:tcPr>
+          <w:p>
+            <w:pPr>
+              <w:jc w:val="left"/>
+              <w:rPr>
+                <w:color w:val="000000" w:themeColor="text1"/>
+              </w:rPr>
+            </w:pPr>
+            <w:r>
+              <w:rPr>
+                <w:color w:val="000000" w:themeColor="text1"/>
+              </w:rPr>
+              <w:t>ID and name</w:t>
+            </w:r>
+          </w:p>
+        </w:tc>
+        <w:tc>
+          <w:tcPr>
+            <w:tcW w:w="7020" w:type="dxa"/>
+            <w:gridSpan w:val="3"/>
+            <w:tcBorders>
+              <w:top w:val="single" w:sz="6" w:space="0" w:color="000000" w:themeColor="text1"/>
+              <w:left w:val="single" w:sz="6" w:space="0" w:color="000000" w:themeColor="text1"/>
+              <w:bottom w:val="single" w:sz="6" w:space="0" w:color="000000" w:themeColor="text1"/>
+              <w:right w:val="single" w:sz="6" w:space="0" w:color="000000" w:themeColor="text1"/>
+            </w:tcBorders>
+          </w:tcPr>
+          <w:p>
+            <w:pPr>
+              <w:jc w:val="left"/>
+              <w:rPr>
+                <w:b/>
+                <w:bCs/>
+                <w:color w:val="000000" w:themeColor="text1"/>
+              </w:rPr>
+            </w:pPr>
+            <w:r>
+              <w:rPr>
+                <w:b/>
+                <w:bCs/>
+                <w:color w:val="000000" w:themeColor="text1"/>
+              </w:rPr>
+              <w:t>UC-</w:t>
+            </w:r>
+            <w:r>
+              <w:rPr>
+                <w:b/>
+                <w:bCs/>
+                <w:color w:val="000000" w:themeColor="text1"/>
+              </w:rPr>
+              <w:t>7</w:t>
+            </w:r>
+            <w:r>
+              <w:rPr>
+                <w:b/>
+                <w:bCs/>
+                <w:color w:val="000000" w:themeColor="text1"/>
+              </w:rPr>
+              <w:t>: Sign In</w:t>
+            </w:r>
+          </w:p>
+        </w:tc>
+      </w:tr>
+      <w:tr>
+        <w:trPr>
+          <w:trHeight w:val="600"/>
+        </w:trPr>
+        <w:tc>
+          <w:tcPr>
+            <w:tcW w:w="2340" w:type="dxa"/>
+            <w:tcBorders>
+              <w:top w:val="single" w:sz="6" w:space="0" w:color="000000" w:themeColor="text1"/>
+              <w:left w:val="single" w:sz="6" w:space="0" w:color="000000" w:themeColor="text1"/>
+              <w:bottom w:val="single" w:sz="6" w:space="0" w:color="000000" w:themeColor="text1"/>
+              <w:right w:val="single" w:sz="6" w:space="0" w:color="000000" w:themeColor="text1"/>
+            </w:tcBorders>
+          </w:tcPr>
+          <w:p>
+            <w:pPr>
+              <w:jc w:val="left"/>
+              <w:rPr>
+                <w:color w:val="000000" w:themeColor="text1"/>
+              </w:rPr>
+            </w:pPr>
+            <w:r>
+              <w:rPr>
+                <w:color w:val="000000" w:themeColor="text1"/>
+              </w:rPr>
+              <w:t>Primary actor</w:t>
+            </w:r>
+          </w:p>
+        </w:tc>
+        <w:tc>
+          <w:tcPr>
+            <w:tcW w:w="2340" w:type="dxa"/>
+            <w:tcBorders>
+              <w:top w:val="single" w:sz="6" w:space="0" w:color="000000" w:themeColor="text1"/>
+              <w:left w:val="single" w:sz="6" w:space="0" w:color="000000" w:themeColor="text1"/>
+              <w:bottom w:val="single" w:sz="6" w:space="0" w:color="000000" w:themeColor="text1"/>
+              <w:right w:val="single" w:sz="6" w:space="0" w:color="000000" w:themeColor="text1"/>
+            </w:tcBorders>
+          </w:tcPr>
+          <w:p>
+            <w:pPr>
+              <w:jc w:val="left"/>
+              <w:rPr>
+                <w:color w:val="000000" w:themeColor="text1"/>
+              </w:rPr>
+            </w:pPr>
+            <w:r>
+              <w:rPr>
+                <w:color w:val="000000" w:themeColor="text1"/>
+              </w:rPr>
+              <w:t>User</w:t>
+            </w:r>
+          </w:p>
+        </w:tc>
+        <w:tc>
+          <w:tcPr>
+            <w:tcW w:w="2340" w:type="dxa"/>
+            <w:tcBorders>
+              <w:top w:val="single" w:sz="6" w:space="0" w:color="000000" w:themeColor="text1"/>
+              <w:left w:val="single" w:sz="6" w:space="0" w:color="000000" w:themeColor="text1"/>
+              <w:bottom w:val="single" w:sz="6" w:space="0" w:color="000000" w:themeColor="text1"/>
+              <w:right w:val="single" w:sz="6" w:space="0" w:color="000000" w:themeColor="text1"/>
+            </w:tcBorders>
+          </w:tcPr>
+          <w:p>
+            <w:pPr>
+              <w:jc w:val="left"/>
+              <w:rPr>
+                <w:color w:val="000000" w:themeColor="text1"/>
+              </w:rPr>
+            </w:pPr>
+            <w:r>
+              <w:rPr>
+                <w:color w:val="000000" w:themeColor="text1"/>
+              </w:rPr>
+              <w:t>Secondary actors</w:t>
+            </w:r>
+          </w:p>
+        </w:tc>
+        <w:tc>
+          <w:tcPr>
+            <w:tcW w:w="2340" w:type="dxa"/>
+            <w:tcBorders>
+              <w:top w:val="single" w:sz="6" w:space="0" w:color="000000" w:themeColor="text1"/>
+              <w:left w:val="single" w:sz="6" w:space="0" w:color="000000" w:themeColor="text1"/>
+              <w:bottom w:val="single" w:sz="6" w:space="0" w:color="000000" w:themeColor="text1"/>
+              <w:right w:val="single" w:sz="6" w:space="0" w:color="000000" w:themeColor="text1"/>
+            </w:tcBorders>
+          </w:tcPr>
+          <w:p>
+            <w:pPr>
+              <w:jc w:val="left"/>
+              <w:rPr>
+                <w:color w:val="000000" w:themeColor="text1"/>
+              </w:rPr>
+            </w:pPr>
+          </w:p>
+        </w:tc>
+      </w:tr>
+      <w:tr>
+        <w:trPr>
+          <w:trHeight w:val="405"/>
+        </w:trPr>
+        <w:tc>
+          <w:tcPr>
+            <w:tcW w:w="2340" w:type="dxa"/>
+            <w:tcBorders>
+              <w:top w:val="single" w:sz="6" w:space="0" w:color="000000" w:themeColor="text1"/>
+              <w:left w:val="single" w:sz="6" w:space="0" w:color="000000" w:themeColor="text1"/>
+              <w:bottom w:val="single" w:sz="6" w:space="0" w:color="000000" w:themeColor="text1"/>
+              <w:right w:val="single" w:sz="6" w:space="0" w:color="000000" w:themeColor="text1"/>
+            </w:tcBorders>
+          </w:tcPr>
+          <w:p>
+            <w:pPr>
+              <w:jc w:val="left"/>
+              <w:rPr>
+                <w:color w:val="000000" w:themeColor="text1"/>
+              </w:rPr>
+            </w:pPr>
+            <w:r>
+              <w:rPr>
+                <w:color w:val="000000" w:themeColor="text1"/>
+              </w:rPr>
+              <w:t>Description</w:t>
+            </w:r>
+          </w:p>
+        </w:tc>
+        <w:tc>
+          <w:tcPr>
+            <w:tcW w:w="7020" w:type="dxa"/>
+            <w:gridSpan w:val="3"/>
+            <w:tcBorders>
+              <w:top w:val="single" w:sz="6" w:space="0" w:color="000000" w:themeColor="text1"/>
+              <w:left w:val="single" w:sz="6" w:space="0" w:color="000000" w:themeColor="text1"/>
+              <w:bottom w:val="single" w:sz="6" w:space="0" w:color="000000" w:themeColor="text1"/>
+              <w:right w:val="single" w:sz="6" w:space="0" w:color="000000" w:themeColor="text1"/>
+            </w:tcBorders>
+          </w:tcPr>
+          <w:p>
+            <w:pPr>
+              <w:jc w:val="left"/>
+              <w:rPr>
+                <w:color w:val="000000" w:themeColor="text1"/>
+              </w:rPr>
+            </w:pPr>
+            <w:r>
+              <w:rPr>
+                <w:color w:val="000000" w:themeColor="text1"/>
+              </w:rPr>
+              <w:t>User wants to sign in</w:t>
+            </w:r>
+          </w:p>
+        </w:tc>
+      </w:tr>
+      <w:tr>
+        <w:trPr>
+          <w:trHeight w:val="405"/>
+        </w:trPr>
+        <w:tc>
+          <w:tcPr>
+            <w:tcW w:w="2340" w:type="dxa"/>
+            <w:tcBorders>
+              <w:top w:val="single" w:sz="6" w:space="0" w:color="000000" w:themeColor="text1"/>
+              <w:left w:val="single" w:sz="6" w:space="0" w:color="000000" w:themeColor="text1"/>
+              <w:bottom w:val="single" w:sz="6" w:space="0" w:color="000000" w:themeColor="text1"/>
+              <w:right w:val="single" w:sz="6" w:space="0" w:color="000000" w:themeColor="text1"/>
+            </w:tcBorders>
+          </w:tcPr>
+          <w:p>
+            <w:pPr>
+              <w:jc w:val="left"/>
+              <w:rPr>
+                <w:color w:val="000000" w:themeColor="text1"/>
+              </w:rPr>
+            </w:pPr>
+            <w:r>
+              <w:rPr>
+                <w:color w:val="000000" w:themeColor="text1"/>
+              </w:rPr>
+              <w:t>Trigger</w:t>
+            </w:r>
+          </w:p>
+        </w:tc>
+        <w:tc>
+          <w:tcPr>
+            <w:tcW w:w="7020" w:type="dxa"/>
+            <w:gridSpan w:val="3"/>
+            <w:tcBorders>
+              <w:top w:val="single" w:sz="6" w:space="0" w:color="000000" w:themeColor="text1"/>
+              <w:left w:val="single" w:sz="6" w:space="0" w:color="000000" w:themeColor="text1"/>
+              <w:bottom w:val="single" w:sz="6" w:space="0" w:color="000000" w:themeColor="text1"/>
+              <w:right w:val="single" w:sz="6" w:space="0" w:color="000000" w:themeColor="text1"/>
+            </w:tcBorders>
+          </w:tcPr>
+          <w:p>
+            <w:pPr>
+              <w:jc w:val="left"/>
+              <w:rPr>
+                <w:color w:val="000000" w:themeColor="text1"/>
+              </w:rPr>
+            </w:pPr>
+            <w:r>
+              <w:rPr>
+                <w:color w:val="000000" w:themeColor="text1"/>
+              </w:rPr>
+              <w:t>User signs in when prompted whether to sign in or sign up</w:t>
+            </w:r>
+          </w:p>
+        </w:tc>
+      </w:tr>
+      <w:tr>
+        <w:trPr>
+          <w:trHeight w:val="405"/>
+        </w:trPr>
+        <w:tc>
+          <w:tcPr>
+            <w:tcW w:w="2340" w:type="dxa"/>
+            <w:tcBorders>
+              <w:top w:val="single" w:sz="6" w:space="0" w:color="000000" w:themeColor="text1"/>
+              <w:left w:val="single" w:sz="6" w:space="0" w:color="000000" w:themeColor="text1"/>
+              <w:bottom w:val="single" w:sz="6" w:space="0" w:color="000000" w:themeColor="text1"/>
+              <w:right w:val="single" w:sz="6" w:space="0" w:color="000000" w:themeColor="text1"/>
+            </w:tcBorders>
+          </w:tcPr>
+          <w:p>
+            <w:pPr>
+              <w:jc w:val="left"/>
+              <w:rPr>
+                <w:color w:val="000000" w:themeColor="text1"/>
+              </w:rPr>
+            </w:pPr>
+            <w:r>
+              <w:rPr>
+                <w:color w:val="000000" w:themeColor="text1"/>
+              </w:rPr>
+              <w:t>Preconditions</w:t>
+            </w:r>
+          </w:p>
+        </w:tc>
+        <w:tc>
+          <w:tcPr>
+            <w:tcW w:w="7020" w:type="dxa"/>
+            <w:gridSpan w:val="3"/>
+            <w:tcBorders>
+              <w:top w:val="single" w:sz="6" w:space="0" w:color="000000" w:themeColor="text1"/>
+              <w:left w:val="single" w:sz="6" w:space="0" w:color="000000" w:themeColor="text1"/>
+              <w:bottom w:val="single" w:sz="6" w:space="0" w:color="000000" w:themeColor="text1"/>
+              <w:right w:val="single" w:sz="6" w:space="0" w:color="000000" w:themeColor="text1"/>
+            </w:tcBorders>
+          </w:tcPr>
+          <w:p>
+            <w:pPr>
+              <w:jc w:val="left"/>
+              <w:rPr>
+                <w:color w:val="000000" w:themeColor="text1"/>
+              </w:rPr>
+            </w:pPr>
+          </w:p>
+        </w:tc>
+      </w:tr>
+      <w:tr>
+        <w:trPr>
+          <w:trHeight w:val="405"/>
+        </w:trPr>
+        <w:tc>
+          <w:tcPr>
+            <w:tcW w:w="2340" w:type="dxa"/>
+            <w:tcBorders>
+              <w:top w:val="single" w:sz="6" w:space="0" w:color="000000" w:themeColor="text1"/>
+              <w:left w:val="single" w:sz="6" w:space="0" w:color="000000" w:themeColor="text1"/>
+              <w:bottom w:val="single" w:sz="6" w:space="0" w:color="000000" w:themeColor="text1"/>
+              <w:right w:val="single" w:sz="6" w:space="0" w:color="000000" w:themeColor="text1"/>
+            </w:tcBorders>
+          </w:tcPr>
+          <w:p>
+            <w:pPr>
+              <w:jc w:val="left"/>
+              <w:rPr>
+                <w:color w:val="000000" w:themeColor="text1"/>
+              </w:rPr>
+            </w:pPr>
+            <w:r>
+              <w:rPr>
+                <w:color w:val="000000" w:themeColor="text1"/>
+              </w:rPr>
+              <w:t>Postconditions</w:t>
+            </w:r>
+          </w:p>
+        </w:tc>
+        <w:tc>
+          <w:tcPr>
+            <w:tcW w:w="7020" w:type="dxa"/>
+            <w:gridSpan w:val="3"/>
+            <w:tcBorders>
+              <w:top w:val="single" w:sz="6" w:space="0" w:color="000000" w:themeColor="text1"/>
+              <w:left w:val="single" w:sz="6" w:space="0" w:color="000000" w:themeColor="text1"/>
+              <w:bottom w:val="single" w:sz="6" w:space="0" w:color="000000" w:themeColor="text1"/>
+              <w:right w:val="single" w:sz="6" w:space="0" w:color="000000" w:themeColor="text1"/>
+            </w:tcBorders>
+          </w:tcPr>
+          <w:p>
+            <w:pPr>
+              <w:jc w:val="left"/>
+              <w:rPr>
+                <w:color w:val="000000" w:themeColor="text1"/>
+              </w:rPr>
+            </w:pPr>
+            <w:r>
+              <w:rPr>
+                <w:color w:val="000000" w:themeColor="text1"/>
+              </w:rPr>
+              <w:t>POST-1: User is now logged in</w:t>
+            </w:r>
+          </w:p>
+        </w:tc>
+      </w:tr>
+      <w:tr>
+        <w:trPr>
+          <w:trHeight w:val="405"/>
+        </w:trPr>
+        <w:tc>
+          <w:tcPr>
+            <w:tcW w:w="2340" w:type="dxa"/>
+            <w:tcBorders>
+              <w:top w:val="single" w:sz="6" w:space="0" w:color="000000" w:themeColor="text1"/>
+              <w:left w:val="single" w:sz="6" w:space="0" w:color="000000" w:themeColor="text1"/>
+              <w:bottom w:val="single" w:sz="6" w:space="0" w:color="000000" w:themeColor="text1"/>
+              <w:right w:val="single" w:sz="6" w:space="0" w:color="000000" w:themeColor="text1"/>
+            </w:tcBorders>
+          </w:tcPr>
+          <w:p>
+            <w:pPr>
+              <w:jc w:val="left"/>
+              <w:rPr>
+                <w:color w:val="000000" w:themeColor="text1"/>
+              </w:rPr>
+            </w:pPr>
+            <w:r>
+              <w:rPr>
+                <w:color w:val="000000" w:themeColor="text1"/>
+              </w:rPr>
+              <w:t>Normal flow</w:t>
+            </w:r>
+          </w:p>
+        </w:tc>
+        <w:tc>
+          <w:tcPr>
+            <w:tcW w:w="7020" w:type="dxa"/>
+            <w:gridSpan w:val="3"/>
+            <w:tcBorders>
+              <w:top w:val="single" w:sz="6" w:space="0" w:color="000000" w:themeColor="text1"/>
+              <w:left w:val="single" w:sz="6" w:space="0" w:color="000000" w:themeColor="text1"/>
+              <w:bottom w:val="single" w:sz="6" w:space="0" w:color="000000" w:themeColor="text1"/>
+              <w:right w:val="single" w:sz="6" w:space="0" w:color="000000" w:themeColor="text1"/>
+            </w:tcBorders>
+          </w:tcPr>
+          <w:p>
+            <w:pPr>
+              <w:jc w:val="left"/>
+              <w:rPr>
+                <w:color w:val="000000" w:themeColor="text1"/>
+              </w:rPr>
+            </w:pPr>
+            <w:r>
+              <w:rPr>
+                <w:color w:val="000000" w:themeColor="text1"/>
+              </w:rPr>
+              <w:t xml:space="preserve">1.0 </w:t>
+            </w:r>
+            <w:r>
+              <w:rPr>
+                <w:b/>
+                <w:bCs/>
+                <w:color w:val="000000" w:themeColor="text1"/>
+              </w:rPr>
+              <w:t>User signs in</w:t>
+            </w:r>
+          </w:p>
+          <w:p>
+            <w:pPr>
+              <w:jc w:val="left"/>
+              <w:rPr>
+                <w:color w:val="000000" w:themeColor="text1"/>
+              </w:rPr>
+            </w:pPr>
+            <w:r>
+              <w:rPr>
+                <w:color w:val="000000" w:themeColor="text1"/>
+              </w:rPr>
+              <w:t xml:space="preserve">1. </w:t>
+            </w:r>
+            <w:r>
+              <w:rPr>
+                <w:color w:val="000000" w:themeColor="text1"/>
+              </w:rPr>
+              <w:t>System prompts the user to enter their credentials</w:t>
+            </w:r>
+          </w:p>
+          <w:p>
+            <w:pPr>
+              <w:jc w:val="left"/>
+              <w:rPr>
+                <w:color w:val="000000" w:themeColor="text1"/>
+              </w:rPr>
+            </w:pPr>
+            <w:r>
+              <w:rPr>
+                <w:color w:val="000000" w:themeColor="text1"/>
+              </w:rPr>
+              <w:t>2</w:t>
+            </w:r>
+            <w:r>
+              <w:rPr>
+                <w:color w:val="000000" w:themeColor="text1"/>
+              </w:rPr>
+              <w:t>. User inputs their username and password</w:t>
+            </w:r>
+          </w:p>
+          <w:p>
+            <w:pPr>
+              <w:jc w:val="left"/>
+              <w:rPr>
+                <w:color w:val="000000" w:themeColor="text1"/>
+              </w:rPr>
+            </w:pPr>
+            <w:r>
+              <w:rPr>
+                <w:color w:val="000000" w:themeColor="text1"/>
+              </w:rPr>
+              <w:t>3</w:t>
+            </w:r>
+            <w:r>
+              <w:rPr>
+                <w:color w:val="000000" w:themeColor="text1"/>
+              </w:rPr>
+              <w:t>.       System validates the username and password and redirects the user to the main page, with the user signed in</w:t>
+            </w:r>
+          </w:p>
+        </w:tc>
+      </w:tr>
+      <w:tr>
+        <w:trPr>
+          <w:trHeight w:val="405"/>
+        </w:trPr>
+        <w:tc>
+          <w:tcPr>
+            <w:tcW w:w="2340" w:type="dxa"/>
+            <w:tcBorders>
+              <w:top w:val="single" w:sz="6" w:space="0" w:color="000000" w:themeColor="text1"/>
+              <w:left w:val="single" w:sz="6" w:space="0" w:color="000000" w:themeColor="text1"/>
+              <w:bottom w:val="single" w:sz="6" w:space="0" w:color="000000" w:themeColor="text1"/>
+              <w:right w:val="single" w:sz="6" w:space="0" w:color="000000" w:themeColor="text1"/>
+            </w:tcBorders>
+          </w:tcPr>
+          <w:p>
+            <w:pPr>
+              <w:jc w:val="left"/>
+              <w:rPr>
+                <w:color w:val="000000" w:themeColor="text1"/>
+              </w:rPr>
+            </w:pPr>
+            <w:r>
+              <w:rPr>
+                <w:color w:val="000000" w:themeColor="text1"/>
+              </w:rPr>
+              <w:t>Alternative flows</w:t>
+            </w:r>
+          </w:p>
+        </w:tc>
+        <w:tc>
+          <w:tcPr>
+            <w:tcW w:w="7020" w:type="dxa"/>
+            <w:gridSpan w:val="3"/>
+            <w:tcBorders>
+              <w:top w:val="single" w:sz="6" w:space="0" w:color="000000" w:themeColor="text1"/>
+              <w:left w:val="single" w:sz="6" w:space="0" w:color="000000" w:themeColor="text1"/>
+              <w:bottom w:val="single" w:sz="6" w:space="0" w:color="000000" w:themeColor="text1"/>
+              <w:right w:val="single" w:sz="6" w:space="0" w:color="000000" w:themeColor="text1"/>
+            </w:tcBorders>
+          </w:tcPr>
+          <w:p>
+            <w:pPr>
+              <w:jc w:val="left"/>
+              <w:rPr>
+                <w:color w:val="000000" w:themeColor="text1"/>
+              </w:rPr>
+            </w:pPr>
+          </w:p>
+        </w:tc>
+      </w:tr>
+      <w:tr>
+        <w:trPr>
+          <w:trHeight w:val="405"/>
+        </w:trPr>
+        <w:tc>
+          <w:tcPr>
+            <w:tcW w:w="2340" w:type="dxa"/>
+            <w:tcBorders>
+              <w:top w:val="single" w:sz="6" w:space="0" w:color="000000" w:themeColor="text1"/>
+              <w:left w:val="single" w:sz="6" w:space="0" w:color="000000" w:themeColor="text1"/>
+              <w:bottom w:val="single" w:sz="6" w:space="0" w:color="000000" w:themeColor="text1"/>
+              <w:right w:val="single" w:sz="6" w:space="0" w:color="000000" w:themeColor="text1"/>
+            </w:tcBorders>
+          </w:tcPr>
+          <w:p>
+            <w:pPr>
+              <w:jc w:val="left"/>
+              <w:rPr>
+                <w:color w:val="000000" w:themeColor="text1"/>
+              </w:rPr>
+            </w:pPr>
+            <w:r>
+              <w:rPr>
+                <w:color w:val="000000" w:themeColor="text1"/>
+              </w:rPr>
+              <w:t>Exceptions</w:t>
+            </w:r>
+          </w:p>
+        </w:tc>
+        <w:tc>
+          <w:tcPr>
+            <w:tcW w:w="7020" w:type="dxa"/>
+            <w:gridSpan w:val="3"/>
+            <w:tcBorders>
+              <w:top w:val="single" w:sz="6" w:space="0" w:color="000000" w:themeColor="text1"/>
+              <w:left w:val="single" w:sz="6" w:space="0" w:color="000000" w:themeColor="text1"/>
+              <w:bottom w:val="single" w:sz="6" w:space="0" w:color="000000" w:themeColor="text1"/>
+              <w:right w:val="single" w:sz="6" w:space="0" w:color="000000" w:themeColor="text1"/>
+            </w:tcBorders>
+          </w:tcPr>
+          <w:p>
+            <w:pPr>
+              <w:jc w:val="left"/>
+              <w:rPr>
+                <w:b/>
+                <w:bCs/>
+                <w:color w:val="000000" w:themeColor="text1"/>
+              </w:rPr>
+            </w:pPr>
+            <w:r>
+              <w:rPr>
+                <w:b/>
+                <w:bCs/>
+                <w:color w:val="000000" w:themeColor="text1"/>
+              </w:rPr>
+              <w:t>3</w:t>
+            </w:r>
+            <w:r>
+              <w:rPr>
+                <w:b/>
+                <w:bCs/>
+                <w:color w:val="000000" w:themeColor="text1"/>
+              </w:rPr>
+              <w:t xml:space="preserve">. E-1 User inputs a wrong username </w:t>
+            </w:r>
+          </w:p>
+          <w:p>
+            <w:pPr>
+              <w:jc w:val="left"/>
+              <w:rPr>
+                <w:color w:val="000000" w:themeColor="text1"/>
+              </w:rPr>
+            </w:pPr>
+            <w:r>
+              <w:rPr>
+                <w:color w:val="000000" w:themeColor="text1"/>
+              </w:rPr>
+              <w:t>1.           System prompts the user to use a different username</w:t>
+            </w:r>
+          </w:p>
+          <w:p>
+            <w:pPr>
+              <w:jc w:val="left"/>
+              <w:rPr>
+                <w:b/>
+                <w:bCs/>
+                <w:color w:val="000000" w:themeColor="text1"/>
+              </w:rPr>
+            </w:pPr>
+            <w:r>
+              <w:rPr>
+                <w:b/>
+                <w:bCs/>
+                <w:color w:val="000000" w:themeColor="text1"/>
+              </w:rPr>
+              <w:t>3</w:t>
+            </w:r>
+            <w:r>
+              <w:rPr>
+                <w:b/>
+                <w:bCs/>
+                <w:color w:val="000000" w:themeColor="text1"/>
+              </w:rPr>
+              <w:t>. E-</w:t>
+            </w:r>
+            <w:r>
+              <w:rPr>
+                <w:b/>
+                <w:bCs/>
+                <w:color w:val="000000" w:themeColor="text1"/>
+              </w:rPr>
+              <w:t>2</w:t>
+            </w:r>
+            <w:r>
+              <w:rPr>
+                <w:b/>
+                <w:bCs/>
+                <w:color w:val="000000" w:themeColor="text1"/>
+              </w:rPr>
+              <w:t xml:space="preserve"> User inputs a wrong </w:t>
+            </w:r>
+            <w:r>
+              <w:rPr>
+                <w:b/>
+                <w:bCs/>
+                <w:color w:val="000000" w:themeColor="text1"/>
+              </w:rPr>
+              <w:t>password</w:t>
+            </w:r>
+          </w:p>
+          <w:p>
+            <w:pPr>
+              <w:jc w:val="left"/>
+              <w:rPr>
+                <w:color w:val="000000" w:themeColor="text1"/>
+              </w:rPr>
+            </w:pPr>
+            <w:r>
+              <w:rPr>
+                <w:color w:val="000000" w:themeColor="text1"/>
+              </w:rPr>
+              <w:t>1.           System prompts the user to use a different password</w:t>
+            </w:r>
           </w:p>
         </w:tc>
       </w:tr>
@@ -3965,723 +5741,6 @@
                 <w:color w:val="000000" w:themeColor="text1"/>
               </w:rPr>
             </w:pPr>
-            <w:r>
-              <w:rPr>
-                <w:color w:val="000000" w:themeColor="text1"/>
-              </w:rPr>
-              <w:t>UC-6: Sign In</w:t>
-            </w:r>
-          </w:p>
-        </w:tc>
-      </w:tr>
-      <w:tr>
-        <w:trPr>
-          <w:trHeight w:val="600"/>
-        </w:trPr>
-        <w:tc>
-          <w:tcPr>
-            <w:tcW w:w="2340" w:type="dxa"/>
-            <w:tcBorders>
-              <w:top w:val="single" w:sz="6" w:space="0" w:color="000000" w:themeColor="text1"/>
-              <w:left w:val="single" w:sz="6" w:space="0" w:color="000000" w:themeColor="text1"/>
-              <w:bottom w:val="single" w:sz="6" w:space="0" w:color="000000" w:themeColor="text1"/>
-              <w:right w:val="single" w:sz="6" w:space="0" w:color="000000" w:themeColor="text1"/>
-            </w:tcBorders>
-          </w:tcPr>
-          <w:p>
-            <w:pPr>
-              <w:jc w:val="left"/>
-              <w:rPr>
-                <w:color w:val="000000" w:themeColor="text1"/>
-              </w:rPr>
-            </w:pPr>
-            <w:r>
-              <w:rPr>
-                <w:color w:val="000000" w:themeColor="text1"/>
-              </w:rPr>
-              <w:t>Primary actor</w:t>
-            </w:r>
-          </w:p>
-        </w:tc>
-        <w:tc>
-          <w:tcPr>
-            <w:tcW w:w="2340" w:type="dxa"/>
-            <w:tcBorders>
-              <w:top w:val="single" w:sz="6" w:space="0" w:color="000000" w:themeColor="text1"/>
-              <w:left w:val="single" w:sz="6" w:space="0" w:color="000000" w:themeColor="text1"/>
-              <w:bottom w:val="single" w:sz="6" w:space="0" w:color="000000" w:themeColor="text1"/>
-              <w:right w:val="single" w:sz="6" w:space="0" w:color="000000" w:themeColor="text1"/>
-            </w:tcBorders>
-          </w:tcPr>
-          <w:p>
-            <w:pPr>
-              <w:jc w:val="left"/>
-              <w:rPr>
-                <w:color w:val="000000" w:themeColor="text1"/>
-              </w:rPr>
-            </w:pPr>
-            <w:r>
-              <w:rPr>
-                <w:color w:val="000000" w:themeColor="text1"/>
-              </w:rPr>
-              <w:t>User</w:t>
-            </w:r>
-          </w:p>
-        </w:tc>
-        <w:tc>
-          <w:tcPr>
-            <w:tcW w:w="2340" w:type="dxa"/>
-            <w:tcBorders>
-              <w:top w:val="single" w:sz="6" w:space="0" w:color="000000" w:themeColor="text1"/>
-              <w:left w:val="single" w:sz="6" w:space="0" w:color="000000" w:themeColor="text1"/>
-              <w:bottom w:val="single" w:sz="6" w:space="0" w:color="000000" w:themeColor="text1"/>
-              <w:right w:val="single" w:sz="6" w:space="0" w:color="000000" w:themeColor="text1"/>
-            </w:tcBorders>
-          </w:tcPr>
-          <w:p>
-            <w:pPr>
-              <w:jc w:val="left"/>
-              <w:rPr>
-                <w:color w:val="000000" w:themeColor="text1"/>
-              </w:rPr>
-            </w:pPr>
-            <w:r>
-              <w:rPr>
-                <w:color w:val="000000" w:themeColor="text1"/>
-              </w:rPr>
-              <w:t>Secondary actors</w:t>
-            </w:r>
-          </w:p>
-        </w:tc>
-        <w:tc>
-          <w:tcPr>
-            <w:tcW w:w="2340" w:type="dxa"/>
-            <w:tcBorders>
-              <w:top w:val="single" w:sz="6" w:space="0" w:color="000000" w:themeColor="text1"/>
-              <w:left w:val="single" w:sz="6" w:space="0" w:color="000000" w:themeColor="text1"/>
-              <w:bottom w:val="single" w:sz="6" w:space="0" w:color="000000" w:themeColor="text1"/>
-              <w:right w:val="single" w:sz="6" w:space="0" w:color="000000" w:themeColor="text1"/>
-            </w:tcBorders>
-          </w:tcPr>
-          <w:p>
-            <w:pPr>
-              <w:jc w:val="left"/>
-              <w:rPr>
-                <w:color w:val="000000" w:themeColor="text1"/>
-              </w:rPr>
-            </w:pPr>
-          </w:p>
-        </w:tc>
-      </w:tr>
-      <w:tr>
-        <w:trPr>
-          <w:trHeight w:val="405"/>
-        </w:trPr>
-        <w:tc>
-          <w:tcPr>
-            <w:tcW w:w="2340" w:type="dxa"/>
-            <w:tcBorders>
-              <w:top w:val="single" w:sz="6" w:space="0" w:color="000000" w:themeColor="text1"/>
-              <w:left w:val="single" w:sz="6" w:space="0" w:color="000000" w:themeColor="text1"/>
-              <w:bottom w:val="single" w:sz="6" w:space="0" w:color="000000" w:themeColor="text1"/>
-              <w:right w:val="single" w:sz="6" w:space="0" w:color="000000" w:themeColor="text1"/>
-            </w:tcBorders>
-          </w:tcPr>
-          <w:p>
-            <w:pPr>
-              <w:jc w:val="left"/>
-              <w:rPr>
-                <w:color w:val="000000" w:themeColor="text1"/>
-              </w:rPr>
-            </w:pPr>
-            <w:r>
-              <w:rPr>
-                <w:color w:val="000000" w:themeColor="text1"/>
-              </w:rPr>
-              <w:t>Description</w:t>
-            </w:r>
-          </w:p>
-        </w:tc>
-        <w:tc>
-          <w:tcPr>
-            <w:tcW w:w="7020" w:type="dxa"/>
-            <w:gridSpan w:val="3"/>
-            <w:tcBorders>
-              <w:top w:val="single" w:sz="6" w:space="0" w:color="000000" w:themeColor="text1"/>
-              <w:left w:val="single" w:sz="6" w:space="0" w:color="000000" w:themeColor="text1"/>
-              <w:bottom w:val="single" w:sz="6" w:space="0" w:color="000000" w:themeColor="text1"/>
-              <w:right w:val="single" w:sz="6" w:space="0" w:color="000000" w:themeColor="text1"/>
-            </w:tcBorders>
-          </w:tcPr>
-          <w:p>
-            <w:pPr>
-              <w:jc w:val="left"/>
-              <w:rPr>
-                <w:color w:val="000000" w:themeColor="text1"/>
-              </w:rPr>
-            </w:pPr>
-            <w:r>
-              <w:rPr>
-                <w:color w:val="000000" w:themeColor="text1"/>
-              </w:rPr>
-              <w:t>User wants to sign in</w:t>
-            </w:r>
-          </w:p>
-        </w:tc>
-      </w:tr>
-      <w:tr>
-        <w:trPr>
-          <w:trHeight w:val="405"/>
-        </w:trPr>
-        <w:tc>
-          <w:tcPr>
-            <w:tcW w:w="2340" w:type="dxa"/>
-            <w:tcBorders>
-              <w:top w:val="single" w:sz="6" w:space="0" w:color="000000" w:themeColor="text1"/>
-              <w:left w:val="single" w:sz="6" w:space="0" w:color="000000" w:themeColor="text1"/>
-              <w:bottom w:val="single" w:sz="6" w:space="0" w:color="000000" w:themeColor="text1"/>
-              <w:right w:val="single" w:sz="6" w:space="0" w:color="000000" w:themeColor="text1"/>
-            </w:tcBorders>
-          </w:tcPr>
-          <w:p>
-            <w:pPr>
-              <w:jc w:val="left"/>
-              <w:rPr>
-                <w:color w:val="000000" w:themeColor="text1"/>
-              </w:rPr>
-            </w:pPr>
-            <w:r>
-              <w:rPr>
-                <w:color w:val="000000" w:themeColor="text1"/>
-              </w:rPr>
-              <w:t>Trigger</w:t>
-            </w:r>
-          </w:p>
-        </w:tc>
-        <w:tc>
-          <w:tcPr>
-            <w:tcW w:w="7020" w:type="dxa"/>
-            <w:gridSpan w:val="3"/>
-            <w:tcBorders>
-              <w:top w:val="single" w:sz="6" w:space="0" w:color="000000" w:themeColor="text1"/>
-              <w:left w:val="single" w:sz="6" w:space="0" w:color="000000" w:themeColor="text1"/>
-              <w:bottom w:val="single" w:sz="6" w:space="0" w:color="000000" w:themeColor="text1"/>
-              <w:right w:val="single" w:sz="6" w:space="0" w:color="000000" w:themeColor="text1"/>
-            </w:tcBorders>
-          </w:tcPr>
-          <w:p>
-            <w:pPr>
-              <w:jc w:val="left"/>
-              <w:rPr>
-                <w:color w:val="000000" w:themeColor="text1"/>
-              </w:rPr>
-            </w:pPr>
-            <w:r>
-              <w:rPr>
-                <w:color w:val="000000" w:themeColor="text1"/>
-              </w:rPr>
-              <w:t>User signs in when prompted whether to sign in or sign up</w:t>
-            </w:r>
-          </w:p>
-        </w:tc>
-      </w:tr>
-      <w:tr>
-        <w:trPr>
-          <w:trHeight w:val="405"/>
-        </w:trPr>
-        <w:tc>
-          <w:tcPr>
-            <w:tcW w:w="2340" w:type="dxa"/>
-            <w:tcBorders>
-              <w:top w:val="single" w:sz="6" w:space="0" w:color="000000" w:themeColor="text1"/>
-              <w:left w:val="single" w:sz="6" w:space="0" w:color="000000" w:themeColor="text1"/>
-              <w:bottom w:val="single" w:sz="6" w:space="0" w:color="000000" w:themeColor="text1"/>
-              <w:right w:val="single" w:sz="6" w:space="0" w:color="000000" w:themeColor="text1"/>
-            </w:tcBorders>
-          </w:tcPr>
-          <w:p>
-            <w:pPr>
-              <w:jc w:val="left"/>
-              <w:rPr>
-                <w:color w:val="000000" w:themeColor="text1"/>
-              </w:rPr>
-            </w:pPr>
-            <w:r>
-              <w:rPr>
-                <w:color w:val="000000" w:themeColor="text1"/>
-              </w:rPr>
-              <w:t>Preconditions</w:t>
-            </w:r>
-          </w:p>
-        </w:tc>
-        <w:tc>
-          <w:tcPr>
-            <w:tcW w:w="7020" w:type="dxa"/>
-            <w:gridSpan w:val="3"/>
-            <w:tcBorders>
-              <w:top w:val="single" w:sz="6" w:space="0" w:color="000000" w:themeColor="text1"/>
-              <w:left w:val="single" w:sz="6" w:space="0" w:color="000000" w:themeColor="text1"/>
-              <w:bottom w:val="single" w:sz="6" w:space="0" w:color="000000" w:themeColor="text1"/>
-              <w:right w:val="single" w:sz="6" w:space="0" w:color="000000" w:themeColor="text1"/>
-            </w:tcBorders>
-          </w:tcPr>
-          <w:p>
-            <w:pPr>
-              <w:jc w:val="left"/>
-              <w:rPr>
-                <w:color w:val="000000" w:themeColor="text1"/>
-              </w:rPr>
-            </w:pPr>
-          </w:p>
-        </w:tc>
-      </w:tr>
-      <w:tr>
-        <w:trPr>
-          <w:trHeight w:val="405"/>
-        </w:trPr>
-        <w:tc>
-          <w:tcPr>
-            <w:tcW w:w="2340" w:type="dxa"/>
-            <w:tcBorders>
-              <w:top w:val="single" w:sz="6" w:space="0" w:color="000000" w:themeColor="text1"/>
-              <w:left w:val="single" w:sz="6" w:space="0" w:color="000000" w:themeColor="text1"/>
-              <w:bottom w:val="single" w:sz="6" w:space="0" w:color="000000" w:themeColor="text1"/>
-              <w:right w:val="single" w:sz="6" w:space="0" w:color="000000" w:themeColor="text1"/>
-            </w:tcBorders>
-          </w:tcPr>
-          <w:p>
-            <w:pPr>
-              <w:jc w:val="left"/>
-              <w:rPr>
-                <w:color w:val="000000" w:themeColor="text1"/>
-              </w:rPr>
-            </w:pPr>
-            <w:r>
-              <w:rPr>
-                <w:color w:val="000000" w:themeColor="text1"/>
-              </w:rPr>
-              <w:t>Postconditions</w:t>
-            </w:r>
-          </w:p>
-        </w:tc>
-        <w:tc>
-          <w:tcPr>
-            <w:tcW w:w="7020" w:type="dxa"/>
-            <w:gridSpan w:val="3"/>
-            <w:tcBorders>
-              <w:top w:val="single" w:sz="6" w:space="0" w:color="000000" w:themeColor="text1"/>
-              <w:left w:val="single" w:sz="6" w:space="0" w:color="000000" w:themeColor="text1"/>
-              <w:bottom w:val="single" w:sz="6" w:space="0" w:color="000000" w:themeColor="text1"/>
-              <w:right w:val="single" w:sz="6" w:space="0" w:color="000000" w:themeColor="text1"/>
-            </w:tcBorders>
-          </w:tcPr>
-          <w:p>
-            <w:pPr>
-              <w:jc w:val="left"/>
-              <w:rPr>
-                <w:color w:val="000000" w:themeColor="text1"/>
-              </w:rPr>
-            </w:pPr>
-            <w:r>
-              <w:rPr>
-                <w:color w:val="000000" w:themeColor="text1"/>
-              </w:rPr>
-              <w:t>POST-1: User is now logged in</w:t>
-            </w:r>
-          </w:p>
-        </w:tc>
-      </w:tr>
-      <w:tr>
-        <w:trPr>
-          <w:trHeight w:val="405"/>
-        </w:trPr>
-        <w:tc>
-          <w:tcPr>
-            <w:tcW w:w="2340" w:type="dxa"/>
-            <w:tcBorders>
-              <w:top w:val="single" w:sz="6" w:space="0" w:color="000000" w:themeColor="text1"/>
-              <w:left w:val="single" w:sz="6" w:space="0" w:color="000000" w:themeColor="text1"/>
-              <w:bottom w:val="single" w:sz="6" w:space="0" w:color="000000" w:themeColor="text1"/>
-              <w:right w:val="single" w:sz="6" w:space="0" w:color="000000" w:themeColor="text1"/>
-            </w:tcBorders>
-          </w:tcPr>
-          <w:p>
-            <w:pPr>
-              <w:jc w:val="left"/>
-              <w:rPr>
-                <w:color w:val="000000" w:themeColor="text1"/>
-              </w:rPr>
-            </w:pPr>
-            <w:r>
-              <w:rPr>
-                <w:color w:val="000000" w:themeColor="text1"/>
-              </w:rPr>
-              <w:t>Normal flow</w:t>
-            </w:r>
-          </w:p>
-        </w:tc>
-        <w:tc>
-          <w:tcPr>
-            <w:tcW w:w="7020" w:type="dxa"/>
-            <w:gridSpan w:val="3"/>
-            <w:tcBorders>
-              <w:top w:val="single" w:sz="6" w:space="0" w:color="000000" w:themeColor="text1"/>
-              <w:left w:val="single" w:sz="6" w:space="0" w:color="000000" w:themeColor="text1"/>
-              <w:bottom w:val="single" w:sz="6" w:space="0" w:color="000000" w:themeColor="text1"/>
-              <w:right w:val="single" w:sz="6" w:space="0" w:color="000000" w:themeColor="text1"/>
-            </w:tcBorders>
-          </w:tcPr>
-          <w:p>
-            <w:pPr>
-              <w:jc w:val="left"/>
-              <w:rPr>
-                <w:color w:val="000000" w:themeColor="text1"/>
-              </w:rPr>
-            </w:pPr>
-            <w:r>
-              <w:rPr>
-                <w:color w:val="000000" w:themeColor="text1"/>
-              </w:rPr>
-              <w:t xml:space="preserve">1.0 </w:t>
-            </w:r>
-            <w:r>
-              <w:rPr>
-                <w:b/>
-                <w:bCs/>
-                <w:color w:val="000000" w:themeColor="text1"/>
-              </w:rPr>
-              <w:t>User signs in</w:t>
-            </w:r>
-          </w:p>
-          <w:p>
-            <w:pPr>
-              <w:jc w:val="left"/>
-              <w:rPr>
-                <w:color w:val="000000" w:themeColor="text1"/>
-              </w:rPr>
-            </w:pPr>
-            <w:r>
-              <w:rPr>
-                <w:color w:val="000000" w:themeColor="text1"/>
-              </w:rPr>
-              <w:t xml:space="preserve">1. </w:t>
-            </w:r>
-            <w:r>
-              <w:rPr>
-                <w:color w:val="000000" w:themeColor="text1"/>
-              </w:rPr>
-              <w:t>System prompts the user to enter their credentials</w:t>
-            </w:r>
-          </w:p>
-          <w:p>
-            <w:pPr>
-              <w:jc w:val="left"/>
-              <w:rPr>
-                <w:color w:val="000000" w:themeColor="text1"/>
-              </w:rPr>
-            </w:pPr>
-            <w:r>
-              <w:rPr>
-                <w:color w:val="000000" w:themeColor="text1"/>
-              </w:rPr>
-              <w:t>2</w:t>
-            </w:r>
-            <w:r>
-              <w:rPr>
-                <w:color w:val="000000" w:themeColor="text1"/>
-              </w:rPr>
-              <w:t>. User inputs their username and password</w:t>
-            </w:r>
-          </w:p>
-          <w:p>
-            <w:pPr>
-              <w:jc w:val="left"/>
-              <w:rPr>
-                <w:color w:val="000000" w:themeColor="text1"/>
-              </w:rPr>
-            </w:pPr>
-            <w:r>
-              <w:rPr>
-                <w:color w:val="000000" w:themeColor="text1"/>
-              </w:rPr>
-              <w:t>3</w:t>
-            </w:r>
-            <w:r>
-              <w:rPr>
-                <w:color w:val="000000" w:themeColor="text1"/>
-              </w:rPr>
-              <w:t>.       System validates the username and password and redirects the user to the main page, with the user signed in</w:t>
-            </w:r>
-          </w:p>
-        </w:tc>
-      </w:tr>
-      <w:tr>
-        <w:trPr>
-          <w:trHeight w:val="405"/>
-        </w:trPr>
-        <w:tc>
-          <w:tcPr>
-            <w:tcW w:w="2340" w:type="dxa"/>
-            <w:tcBorders>
-              <w:top w:val="single" w:sz="6" w:space="0" w:color="000000" w:themeColor="text1"/>
-              <w:left w:val="single" w:sz="6" w:space="0" w:color="000000" w:themeColor="text1"/>
-              <w:bottom w:val="single" w:sz="6" w:space="0" w:color="000000" w:themeColor="text1"/>
-              <w:right w:val="single" w:sz="6" w:space="0" w:color="000000" w:themeColor="text1"/>
-            </w:tcBorders>
-          </w:tcPr>
-          <w:p>
-            <w:pPr>
-              <w:jc w:val="left"/>
-              <w:rPr>
-                <w:color w:val="000000" w:themeColor="text1"/>
-              </w:rPr>
-            </w:pPr>
-            <w:r>
-              <w:rPr>
-                <w:color w:val="000000" w:themeColor="text1"/>
-              </w:rPr>
-              <w:t>Alternative flows</w:t>
-            </w:r>
-          </w:p>
-        </w:tc>
-        <w:tc>
-          <w:tcPr>
-            <w:tcW w:w="7020" w:type="dxa"/>
-            <w:gridSpan w:val="3"/>
-            <w:tcBorders>
-              <w:top w:val="single" w:sz="6" w:space="0" w:color="000000" w:themeColor="text1"/>
-              <w:left w:val="single" w:sz="6" w:space="0" w:color="000000" w:themeColor="text1"/>
-              <w:bottom w:val="single" w:sz="6" w:space="0" w:color="000000" w:themeColor="text1"/>
-              <w:right w:val="single" w:sz="6" w:space="0" w:color="000000" w:themeColor="text1"/>
-            </w:tcBorders>
-          </w:tcPr>
-          <w:p>
-            <w:pPr>
-              <w:jc w:val="left"/>
-              <w:rPr>
-                <w:color w:val="000000" w:themeColor="text1"/>
-              </w:rPr>
-            </w:pPr>
-          </w:p>
-        </w:tc>
-      </w:tr>
-      <w:tr>
-        <w:trPr>
-          <w:trHeight w:val="405"/>
-        </w:trPr>
-        <w:tc>
-          <w:tcPr>
-            <w:tcW w:w="2340" w:type="dxa"/>
-            <w:tcBorders>
-              <w:top w:val="single" w:sz="6" w:space="0" w:color="000000" w:themeColor="text1"/>
-              <w:left w:val="single" w:sz="6" w:space="0" w:color="000000" w:themeColor="text1"/>
-              <w:bottom w:val="single" w:sz="6" w:space="0" w:color="000000" w:themeColor="text1"/>
-              <w:right w:val="single" w:sz="6" w:space="0" w:color="000000" w:themeColor="text1"/>
-            </w:tcBorders>
-          </w:tcPr>
-          <w:p>
-            <w:pPr>
-              <w:jc w:val="left"/>
-              <w:rPr>
-                <w:color w:val="000000" w:themeColor="text1"/>
-              </w:rPr>
-            </w:pPr>
-            <w:r>
-              <w:rPr>
-                <w:color w:val="000000" w:themeColor="text1"/>
-              </w:rPr>
-              <w:t>Exceptions</w:t>
-            </w:r>
-          </w:p>
-        </w:tc>
-        <w:tc>
-          <w:tcPr>
-            <w:tcW w:w="7020" w:type="dxa"/>
-            <w:gridSpan w:val="3"/>
-            <w:tcBorders>
-              <w:top w:val="single" w:sz="6" w:space="0" w:color="000000" w:themeColor="text1"/>
-              <w:left w:val="single" w:sz="6" w:space="0" w:color="000000" w:themeColor="text1"/>
-              <w:bottom w:val="single" w:sz="6" w:space="0" w:color="000000" w:themeColor="text1"/>
-              <w:right w:val="single" w:sz="6" w:space="0" w:color="000000" w:themeColor="text1"/>
-            </w:tcBorders>
-          </w:tcPr>
-          <w:p>
-            <w:pPr>
-              <w:jc w:val="left"/>
-              <w:rPr>
-                <w:b/>
-                <w:bCs/>
-                <w:color w:val="000000" w:themeColor="text1"/>
-              </w:rPr>
-            </w:pPr>
-            <w:r>
-              <w:rPr>
-                <w:b/>
-                <w:bCs/>
-                <w:color w:val="000000" w:themeColor="text1"/>
-              </w:rPr>
-              <w:t>3</w:t>
-            </w:r>
-            <w:r>
-              <w:rPr>
-                <w:b/>
-                <w:bCs/>
-                <w:color w:val="000000" w:themeColor="text1"/>
-              </w:rPr>
-              <w:t xml:space="preserve">. E-1 User inputs a wrong username </w:t>
-            </w:r>
-          </w:p>
-          <w:p>
-            <w:pPr>
-              <w:jc w:val="left"/>
-              <w:rPr>
-                <w:color w:val="000000" w:themeColor="text1"/>
-              </w:rPr>
-            </w:pPr>
-            <w:r>
-              <w:rPr>
-                <w:color w:val="000000" w:themeColor="text1"/>
-              </w:rPr>
-              <w:t>1.           System prompts the user to use a different username</w:t>
-            </w:r>
-          </w:p>
-          <w:p>
-            <w:pPr>
-              <w:jc w:val="left"/>
-              <w:rPr>
-                <w:b/>
-                <w:bCs/>
-                <w:color w:val="000000" w:themeColor="text1"/>
-              </w:rPr>
-            </w:pPr>
-            <w:r>
-              <w:rPr>
-                <w:b/>
-                <w:bCs/>
-                <w:color w:val="000000" w:themeColor="text1"/>
-              </w:rPr>
-              <w:t>3</w:t>
-            </w:r>
-            <w:r>
-              <w:rPr>
-                <w:b/>
-                <w:bCs/>
-                <w:color w:val="000000" w:themeColor="text1"/>
-              </w:rPr>
-              <w:t>. E-</w:t>
-            </w:r>
-            <w:r>
-              <w:rPr>
-                <w:b/>
-                <w:bCs/>
-                <w:color w:val="000000" w:themeColor="text1"/>
-              </w:rPr>
-              <w:t>2</w:t>
-            </w:r>
-            <w:r>
-              <w:rPr>
-                <w:b/>
-                <w:bCs/>
-                <w:color w:val="000000" w:themeColor="text1"/>
-              </w:rPr>
-              <w:t xml:space="preserve"> User inputs a wrong </w:t>
-            </w:r>
-            <w:r>
-              <w:rPr>
-                <w:b/>
-                <w:bCs/>
-                <w:color w:val="000000" w:themeColor="text1"/>
-              </w:rPr>
-              <w:t>password</w:t>
-            </w:r>
-          </w:p>
-          <w:p>
-            <w:pPr>
-              <w:jc w:val="left"/>
-              <w:rPr>
-                <w:color w:val="000000" w:themeColor="text1"/>
-              </w:rPr>
-            </w:pPr>
-            <w:r>
-              <w:rPr>
-                <w:color w:val="000000" w:themeColor="text1"/>
-              </w:rPr>
-              <w:lastRenderedPageBreak/>
-              <w:t xml:space="preserve">1.           System prompts the user to use a different </w:t>
-            </w:r>
-            <w:r>
-              <w:rPr>
-                <w:color w:val="000000" w:themeColor="text1"/>
-              </w:rPr>
-              <w:t>password</w:t>
-            </w:r>
-          </w:p>
-        </w:tc>
-      </w:tr>
-    </w:tbl>
-    <w:p/>
-    <w:p/>
-    <w:p/>
-    <w:tbl>
-      <w:tblPr>
-        <w:tblStyle w:val="TableGrid"/>
-        <w:tblW w:w="0" w:type="auto"/>
-        <w:tblLayout w:type="fixed"/>
-        <w:tblLook w:val="0000" w:firstRow="0" w:lastRow="0" w:firstColumn="0" w:lastColumn="0" w:noHBand="0" w:noVBand="0"/>
-      </w:tblPr>
-      <w:tblGrid>
-        <w:gridCol w:w="2340"/>
-        <w:gridCol w:w="2340"/>
-        <w:gridCol w:w="2340"/>
-        <w:gridCol w:w="2340"/>
-      </w:tblGrid>
-      <w:tr>
-        <w:trPr>
-          <w:trHeight w:val="405"/>
-        </w:trPr>
-        <w:tc>
-          <w:tcPr>
-            <w:tcW w:w="2340" w:type="dxa"/>
-            <w:tcBorders>
-              <w:top w:val="single" w:sz="6" w:space="0" w:color="000000" w:themeColor="text1"/>
-              <w:left w:val="single" w:sz="6" w:space="0" w:color="000000" w:themeColor="text1"/>
-              <w:bottom w:val="single" w:sz="6" w:space="0" w:color="000000" w:themeColor="text1"/>
-              <w:right w:val="single" w:sz="6" w:space="0" w:color="000000" w:themeColor="text1"/>
-            </w:tcBorders>
-          </w:tcPr>
-          <w:p>
-            <w:pPr>
-              <w:jc w:val="left"/>
-              <w:rPr>
-                <w:color w:val="000000" w:themeColor="text1"/>
-              </w:rPr>
-            </w:pPr>
-            <w:r>
-              <w:rPr>
-                <w:color w:val="000000" w:themeColor="text1"/>
-              </w:rPr>
-              <w:t>ID and name</w:t>
-            </w:r>
-          </w:p>
-        </w:tc>
-        <w:tc>
-          <w:tcPr>
-            <w:tcW w:w="7020" w:type="dxa"/>
-            <w:gridSpan w:val="3"/>
-            <w:tcBorders>
-              <w:top w:val="single" w:sz="6" w:space="0" w:color="000000" w:themeColor="text1"/>
-              <w:left w:val="single" w:sz="6" w:space="0" w:color="000000" w:themeColor="text1"/>
-              <w:bottom w:val="single" w:sz="6" w:space="0" w:color="000000" w:themeColor="text1"/>
-              <w:right w:val="single" w:sz="6" w:space="0" w:color="000000" w:themeColor="text1"/>
-            </w:tcBorders>
-          </w:tcPr>
-          <w:p>
-            <w:pPr>
-              <w:jc w:val="left"/>
-              <w:rPr>
-                <w:color w:val="000000" w:themeColor="text1"/>
-              </w:rPr>
-            </w:pPr>
           </w:p>
         </w:tc>
       </w:tr>
@@ -5909,6 +6968,95 @@
     </w:lvl>
   </w:abstractNum>
   <w:abstractNum w:abstractNumId="7" w15:restartNumberingAfterBreak="0">
+    <w:nsid w:val="27C86727"/>
+    <w:multiLevelType w:val="hybridMultilevel"/>
+    <w:tmpl w:val="F5A675F4"/>
+    <w:lvl w:ilvl="0" w:tplc="FFFFFFFF">
+      <w:start w:val="1"/>
+      <w:numFmt w:val="decimal"/>
+      <w:lvlText w:val="%1."/>
+      <w:lvlJc w:val="left"/>
+      <w:pPr>
+        <w:ind w:left="720" w:hanging="360"/>
+      </w:pPr>
+      <w:rPr>
+        <w:rFonts w:hint="default"/>
+      </w:rPr>
+    </w:lvl>
+    <w:lvl w:ilvl="1" w:tplc="FFFFFFFF" w:tentative="1">
+      <w:start w:val="1"/>
+      <w:numFmt w:val="lowerLetter"/>
+      <w:lvlText w:val="%2."/>
+      <w:lvlJc w:val="left"/>
+      <w:pPr>
+        <w:ind w:left="1440" w:hanging="360"/>
+      </w:pPr>
+    </w:lvl>
+    <w:lvl w:ilvl="2" w:tplc="FFFFFFFF" w:tentative="1">
+      <w:start w:val="1"/>
+      <w:numFmt w:val="lowerRoman"/>
+      <w:lvlText w:val="%3."/>
+      <w:lvlJc w:val="right"/>
+      <w:pPr>
+        <w:ind w:left="2160" w:hanging="180"/>
+      </w:pPr>
+    </w:lvl>
+    <w:lvl w:ilvl="3" w:tplc="FFFFFFFF" w:tentative="1">
+      <w:start w:val="1"/>
+      <w:numFmt w:val="decimal"/>
+      <w:lvlText w:val="%4."/>
+      <w:lvlJc w:val="left"/>
+      <w:pPr>
+        <w:ind w:left="2880" w:hanging="360"/>
+      </w:pPr>
+    </w:lvl>
+    <w:lvl w:ilvl="4" w:tplc="FFFFFFFF" w:tentative="1">
+      <w:start w:val="1"/>
+      <w:numFmt w:val="lowerLetter"/>
+      <w:lvlText w:val="%5."/>
+      <w:lvlJc w:val="left"/>
+      <w:pPr>
+        <w:ind w:left="3600" w:hanging="360"/>
+      </w:pPr>
+    </w:lvl>
+    <w:lvl w:ilvl="5" w:tplc="FFFFFFFF" w:tentative="1">
+      <w:start w:val="1"/>
+      <w:numFmt w:val="lowerRoman"/>
+      <w:lvlText w:val="%6."/>
+      <w:lvlJc w:val="right"/>
+      <w:pPr>
+        <w:ind w:left="4320" w:hanging="180"/>
+      </w:pPr>
+    </w:lvl>
+    <w:lvl w:ilvl="6" w:tplc="FFFFFFFF" w:tentative="1">
+      <w:start w:val="1"/>
+      <w:numFmt w:val="decimal"/>
+      <w:lvlText w:val="%7."/>
+      <w:lvlJc w:val="left"/>
+      <w:pPr>
+        <w:ind w:left="5040" w:hanging="360"/>
+      </w:pPr>
+    </w:lvl>
+    <w:lvl w:ilvl="7" w:tplc="FFFFFFFF" w:tentative="1">
+      <w:start w:val="1"/>
+      <w:numFmt w:val="lowerLetter"/>
+      <w:lvlText w:val="%8."/>
+      <w:lvlJc w:val="left"/>
+      <w:pPr>
+        <w:ind w:left="5760" w:hanging="360"/>
+      </w:pPr>
+    </w:lvl>
+    <w:lvl w:ilvl="8" w:tplc="FFFFFFFF" w:tentative="1">
+      <w:start w:val="1"/>
+      <w:numFmt w:val="lowerRoman"/>
+      <w:lvlText w:val="%9."/>
+      <w:lvlJc w:val="right"/>
+      <w:pPr>
+        <w:ind w:left="6480" w:hanging="180"/>
+      </w:pPr>
+    </w:lvl>
+  </w:abstractNum>
+  <w:abstractNum w:abstractNumId="8" w15:restartNumberingAfterBreak="0">
     <w:nsid w:val="28126C60"/>
     <w:multiLevelType w:val="multilevel"/>
     <w:tmpl w:val="D354B58A"/>
@@ -6021,7 +7169,7 @@
       </w:rPr>
     </w:lvl>
   </w:abstractNum>
-  <w:abstractNum w:abstractNumId="8" w15:restartNumberingAfterBreak="0">
+  <w:abstractNum w:abstractNumId="9" w15:restartNumberingAfterBreak="0">
     <w:nsid w:val="2D671441"/>
     <w:multiLevelType w:val="multilevel"/>
     <w:tmpl w:val="80BC1642"/>
@@ -6134,7 +7282,7 @@
       </w:rPr>
     </w:lvl>
   </w:abstractNum>
-  <w:abstractNum w:abstractNumId="9" w15:restartNumberingAfterBreak="0">
+  <w:abstractNum w:abstractNumId="10" w15:restartNumberingAfterBreak="0">
     <w:nsid w:val="3CEF66FD"/>
     <w:multiLevelType w:val="multilevel"/>
     <w:tmpl w:val="97807F24"/>
@@ -6247,7 +7395,7 @@
       </w:rPr>
     </w:lvl>
   </w:abstractNum>
-  <w:abstractNum w:abstractNumId="10" w15:restartNumberingAfterBreak="0">
+  <w:abstractNum w:abstractNumId="11" w15:restartNumberingAfterBreak="0">
     <w:nsid w:val="3F0153E7"/>
     <w:multiLevelType w:val="multilevel"/>
     <w:tmpl w:val="24F4E76C"/>
@@ -6360,7 +7508,7 @@
       </w:rPr>
     </w:lvl>
   </w:abstractNum>
-  <w:abstractNum w:abstractNumId="11" w15:restartNumberingAfterBreak="0">
+  <w:abstractNum w:abstractNumId="12" w15:restartNumberingAfterBreak="0">
     <w:nsid w:val="43107805"/>
     <w:multiLevelType w:val="hybridMultilevel"/>
     <w:tmpl w:val="EB2C9046"/>
@@ -6449,11 +7597,11 @@
       </w:pPr>
     </w:lvl>
   </w:abstractNum>
-  <w:abstractNum w:abstractNumId="12" w15:restartNumberingAfterBreak="0">
+  <w:abstractNum w:abstractNumId="13" w15:restartNumberingAfterBreak="0">
     <w:nsid w:val="475079C4"/>
-    <w:multiLevelType w:val="hybridMultilevel"/>
-    <w:tmpl w:val="5F10761A"/>
-    <w:lvl w:ilvl="0" w:tplc="0B32EE80">
+    <w:multiLevelType w:val="multilevel"/>
+    <w:tmpl w:val="59DCCDEE"/>
+    <w:lvl w:ilvl="0">
       <w:start w:val="1"/>
       <w:numFmt w:val="decimal"/>
       <w:lvlText w:val="%1."/>
@@ -6465,80 +7613,112 @@
         <w:rFonts w:hint="default"/>
       </w:rPr>
     </w:lvl>
-    <w:lvl w:ilvl="1" w:tplc="04090019" w:tentative="1">
-      <w:start w:val="1"/>
-      <w:numFmt w:val="lowerLetter"/>
-      <w:lvlText w:val="%2."/>
-      <w:lvlJc w:val="left"/>
-      <w:pPr>
-        <w:ind w:left="1440" w:hanging="360"/>
-      </w:pPr>
-    </w:lvl>
-    <w:lvl w:ilvl="2" w:tplc="0409001B" w:tentative="1">
-      <w:start w:val="1"/>
-      <w:numFmt w:val="lowerRoman"/>
-      <w:lvlText w:val="%3."/>
-      <w:lvlJc w:val="right"/>
-      <w:pPr>
-        <w:ind w:left="2160" w:hanging="180"/>
-      </w:pPr>
-    </w:lvl>
-    <w:lvl w:ilvl="3" w:tplc="0409000F" w:tentative="1">
+    <w:lvl w:ilvl="1">
       <w:start w:val="1"/>
       <w:numFmt w:val="decimal"/>
-      <w:lvlText w:val="%4."/>
-      <w:lvlJc w:val="left"/>
-      <w:pPr>
-        <w:ind w:left="2880" w:hanging="360"/>
-      </w:pPr>
-    </w:lvl>
-    <w:lvl w:ilvl="4" w:tplc="04090019" w:tentative="1">
-      <w:start w:val="1"/>
-      <w:numFmt w:val="lowerLetter"/>
-      <w:lvlText w:val="%5."/>
-      <w:lvlJc w:val="left"/>
-      <w:pPr>
-        <w:ind w:left="3600" w:hanging="360"/>
-      </w:pPr>
-    </w:lvl>
-    <w:lvl w:ilvl="5" w:tplc="0409001B" w:tentative="1">
-      <w:start w:val="1"/>
-      <w:numFmt w:val="lowerRoman"/>
-      <w:lvlText w:val="%6."/>
-      <w:lvlJc w:val="right"/>
-      <w:pPr>
-        <w:ind w:left="4320" w:hanging="180"/>
-      </w:pPr>
-    </w:lvl>
-    <w:lvl w:ilvl="6" w:tplc="0409000F" w:tentative="1">
+      <w:isLgl/>
+      <w:lvlText w:val="%1.%2"/>
+      <w:lvlJc w:val="left"/>
+      <w:pPr>
+        <w:ind w:left="732" w:hanging="372"/>
+      </w:pPr>
+      <w:rPr>
+        <w:rFonts w:hint="default"/>
+      </w:rPr>
+    </w:lvl>
+    <w:lvl w:ilvl="2">
       <w:start w:val="1"/>
       <w:numFmt w:val="decimal"/>
-      <w:lvlText w:val="%7."/>
-      <w:lvlJc w:val="left"/>
-      <w:pPr>
-        <w:ind w:left="5040" w:hanging="360"/>
-      </w:pPr>
-    </w:lvl>
-    <w:lvl w:ilvl="7" w:tplc="04090019" w:tentative="1">
-      <w:start w:val="1"/>
-      <w:numFmt w:val="lowerLetter"/>
-      <w:lvlText w:val="%8."/>
-      <w:lvlJc w:val="left"/>
-      <w:pPr>
-        <w:ind w:left="5760" w:hanging="360"/>
-      </w:pPr>
-    </w:lvl>
-    <w:lvl w:ilvl="8" w:tplc="0409001B" w:tentative="1">
-      <w:start w:val="1"/>
-      <w:numFmt w:val="lowerRoman"/>
-      <w:lvlText w:val="%9."/>
-      <w:lvlJc w:val="right"/>
-      <w:pPr>
-        <w:ind w:left="6480" w:hanging="180"/>
-      </w:pPr>
+      <w:isLgl/>
+      <w:lvlText w:val="%1.%2.%3"/>
+      <w:lvlJc w:val="left"/>
+      <w:pPr>
+        <w:ind w:left="1080" w:hanging="720"/>
+      </w:pPr>
+      <w:rPr>
+        <w:rFonts w:hint="default"/>
+      </w:rPr>
+    </w:lvl>
+    <w:lvl w:ilvl="3">
+      <w:start w:val="1"/>
+      <w:numFmt w:val="decimal"/>
+      <w:isLgl/>
+      <w:lvlText w:val="%1.%2.%3.%4"/>
+      <w:lvlJc w:val="left"/>
+      <w:pPr>
+        <w:ind w:left="1080" w:hanging="720"/>
+      </w:pPr>
+      <w:rPr>
+        <w:rFonts w:hint="default"/>
+      </w:rPr>
+    </w:lvl>
+    <w:lvl w:ilvl="4">
+      <w:start w:val="1"/>
+      <w:numFmt w:val="decimal"/>
+      <w:isLgl/>
+      <w:lvlText w:val="%1.%2.%3.%4.%5"/>
+      <w:lvlJc w:val="left"/>
+      <w:pPr>
+        <w:ind w:left="1440" w:hanging="1080"/>
+      </w:pPr>
+      <w:rPr>
+        <w:rFonts w:hint="default"/>
+      </w:rPr>
+    </w:lvl>
+    <w:lvl w:ilvl="5">
+      <w:start w:val="1"/>
+      <w:numFmt w:val="decimal"/>
+      <w:isLgl/>
+      <w:lvlText w:val="%1.%2.%3.%4.%5.%6"/>
+      <w:lvlJc w:val="left"/>
+      <w:pPr>
+        <w:ind w:left="1440" w:hanging="1080"/>
+      </w:pPr>
+      <w:rPr>
+        <w:rFonts w:hint="default"/>
+      </w:rPr>
+    </w:lvl>
+    <w:lvl w:ilvl="6">
+      <w:start w:val="1"/>
+      <w:numFmt w:val="decimal"/>
+      <w:isLgl/>
+      <w:lvlText w:val="%1.%2.%3.%4.%5.%6.%7"/>
+      <w:lvlJc w:val="left"/>
+      <w:pPr>
+        <w:ind w:left="1800" w:hanging="1440"/>
+      </w:pPr>
+      <w:rPr>
+        <w:rFonts w:hint="default"/>
+      </w:rPr>
+    </w:lvl>
+    <w:lvl w:ilvl="7">
+      <w:start w:val="1"/>
+      <w:numFmt w:val="decimal"/>
+      <w:isLgl/>
+      <w:lvlText w:val="%1.%2.%3.%4.%5.%6.%7.%8"/>
+      <w:lvlJc w:val="left"/>
+      <w:pPr>
+        <w:ind w:left="1800" w:hanging="1440"/>
+      </w:pPr>
+      <w:rPr>
+        <w:rFonts w:hint="default"/>
+      </w:rPr>
+    </w:lvl>
+    <w:lvl w:ilvl="8">
+      <w:start w:val="1"/>
+      <w:numFmt w:val="decimal"/>
+      <w:isLgl/>
+      <w:lvlText w:val="%1.%2.%3.%4.%5.%6.%7.%8.%9"/>
+      <w:lvlJc w:val="left"/>
+      <w:pPr>
+        <w:ind w:left="2160" w:hanging="1800"/>
+      </w:pPr>
+      <w:rPr>
+        <w:rFonts w:hint="default"/>
+      </w:rPr>
     </w:lvl>
   </w:abstractNum>
-  <w:abstractNum w:abstractNumId="13" w15:restartNumberingAfterBreak="0">
+  <w:abstractNum w:abstractNumId="14" w15:restartNumberingAfterBreak="0">
     <w:nsid w:val="594C1356"/>
     <w:multiLevelType w:val="hybridMultilevel"/>
     <w:tmpl w:val="B4F01358"/>
@@ -6627,7 +7807,7 @@
       </w:pPr>
     </w:lvl>
   </w:abstractNum>
-  <w:abstractNum w:abstractNumId="14" w15:restartNumberingAfterBreak="0">
+  <w:abstractNum w:abstractNumId="15" w15:restartNumberingAfterBreak="0">
     <w:nsid w:val="5E09568A"/>
     <w:multiLevelType w:val="hybridMultilevel"/>
     <w:tmpl w:val="BC1C2262"/>
@@ -6716,7 +7896,7 @@
       </w:pPr>
     </w:lvl>
   </w:abstractNum>
-  <w:abstractNum w:abstractNumId="15" w15:restartNumberingAfterBreak="0">
+  <w:abstractNum w:abstractNumId="16" w15:restartNumberingAfterBreak="0">
     <w:nsid w:val="66B46761"/>
     <w:multiLevelType w:val="hybridMultilevel"/>
     <w:tmpl w:val="A878AE56"/>
@@ -6802,7 +7982,7 @@
       </w:pPr>
     </w:lvl>
   </w:abstractNum>
-  <w:abstractNum w:abstractNumId="16" w15:restartNumberingAfterBreak="0">
+  <w:abstractNum w:abstractNumId="17" w15:restartNumberingAfterBreak="0">
     <w:nsid w:val="6C2E70C5"/>
     <w:multiLevelType w:val="hybridMultilevel"/>
     <w:tmpl w:val="1ACC5D3E"/>
@@ -6891,7 +8071,7 @@
       </w:pPr>
     </w:lvl>
   </w:abstractNum>
-  <w:abstractNum w:abstractNumId="17" w15:restartNumberingAfterBreak="0">
+  <w:abstractNum w:abstractNumId="18" w15:restartNumberingAfterBreak="0">
     <w:nsid w:val="6E8826B5"/>
     <w:multiLevelType w:val="hybridMultilevel"/>
     <w:tmpl w:val="AD2268D2"/>
@@ -6980,7 +8160,7 @@
       </w:pPr>
     </w:lvl>
   </w:abstractNum>
-  <w:abstractNum w:abstractNumId="18" w15:restartNumberingAfterBreak="0">
+  <w:abstractNum w:abstractNumId="19" w15:restartNumberingAfterBreak="0">
     <w:nsid w:val="7AF85BB7"/>
     <w:multiLevelType w:val="hybridMultilevel"/>
     <w:tmpl w:val="21B8DEA2"/>
@@ -7069,7 +8249,7 @@
       </w:pPr>
     </w:lvl>
   </w:abstractNum>
-  <w:abstractNum w:abstractNumId="19" w15:restartNumberingAfterBreak="0">
+  <w:abstractNum w:abstractNumId="20" w15:restartNumberingAfterBreak="0">
     <w:nsid w:val="7BF8252B"/>
     <w:multiLevelType w:val="multilevel"/>
     <w:tmpl w:val="73F4EF08"/>
@@ -7193,7 +8373,7 @@
     <w:abstractNumId w:val="3"/>
   </w:num>
   <w:num w:numId="2" w16cid:durableId="1605108232">
-    <w:abstractNumId w:val="9"/>
+    <w:abstractNumId w:val="10"/>
   </w:num>
   <w:num w:numId="3" w16cid:durableId="1565137455">
     <w:abstractNumId w:val="1"/>
@@ -7202,52 +8382,55 @@
     <w:abstractNumId w:val="5"/>
   </w:num>
   <w:num w:numId="5" w16cid:durableId="778526114">
-    <w:abstractNumId w:val="10"/>
+    <w:abstractNumId w:val="11"/>
   </w:num>
   <w:num w:numId="6" w16cid:durableId="587467285">
-    <w:abstractNumId w:val="8"/>
+    <w:abstractNumId w:val="9"/>
   </w:num>
   <w:num w:numId="7" w16cid:durableId="2087143080">
-    <w:abstractNumId w:val="15"/>
+    <w:abstractNumId w:val="16"/>
   </w:num>
   <w:num w:numId="8" w16cid:durableId="1340501201">
     <w:abstractNumId w:val="6"/>
   </w:num>
   <w:num w:numId="9" w16cid:durableId="1317342804">
-    <w:abstractNumId w:val="14"/>
+    <w:abstractNumId w:val="15"/>
   </w:num>
   <w:num w:numId="10" w16cid:durableId="2024015866">
-    <w:abstractNumId w:val="7"/>
+    <w:abstractNumId w:val="8"/>
   </w:num>
   <w:num w:numId="11" w16cid:durableId="441532329">
-    <w:abstractNumId w:val="11"/>
+    <w:abstractNumId w:val="12"/>
   </w:num>
   <w:num w:numId="12" w16cid:durableId="335696583">
-    <w:abstractNumId w:val="13"/>
+    <w:abstractNumId w:val="14"/>
   </w:num>
   <w:num w:numId="13" w16cid:durableId="187376214">
     <w:abstractNumId w:val="0"/>
   </w:num>
   <w:num w:numId="14" w16cid:durableId="1044599997">
-    <w:abstractNumId w:val="16"/>
+    <w:abstractNumId w:val="17"/>
   </w:num>
   <w:num w:numId="15" w16cid:durableId="237835714">
-    <w:abstractNumId w:val="17"/>
+    <w:abstractNumId w:val="18"/>
   </w:num>
   <w:num w:numId="16" w16cid:durableId="1189181784">
-    <w:abstractNumId w:val="12"/>
+    <w:abstractNumId w:val="13"/>
   </w:num>
   <w:num w:numId="17" w16cid:durableId="1034380424">
-    <w:abstractNumId w:val="19"/>
+    <w:abstractNumId w:val="20"/>
   </w:num>
   <w:num w:numId="18" w16cid:durableId="845439252">
-    <w:abstractNumId w:val="18"/>
+    <w:abstractNumId w:val="19"/>
   </w:num>
   <w:num w:numId="19" w16cid:durableId="1877697689">
     <w:abstractNumId w:val="2"/>
   </w:num>
   <w:num w:numId="20" w16cid:durableId="257174251">
     <w:abstractNumId w:val="4"/>
+  </w:num>
+  <w:num w:numId="21" w16cid:durableId="2111272218">
+    <w:abstractNumId w:val="7"/>
   </w:num>
 </w:numbering>
 </file>
@@ -7651,7 +8834,7 @@
   <w:style w:type="paragraph" w:default="1" w:styleId="Normal">
     <w:name w:val="Normal"/>
     <w:qFormat/>
-    <w:rsid w:val="00BB1221"/>
+    <w:rsid w:val="00976EB6"/>
   </w:style>
   <w:style w:type="paragraph" w:styleId="Heading1">
     <w:name w:val="heading 1"/>
@@ -7768,7 +8951,6 @@
   <w:style w:type="character" w:default="1" w:styleId="DefaultParagraphFont">
     <w:name w:val="Default Paragraph Font"/>
     <w:uiPriority w:val="1"/>
-    <w:semiHidden/>
     <w:unhideWhenUsed/>
   </w:style>
   <w:style w:type="table" w:default="1" w:styleId="TableNormal">
@@ -8257,21 +9439,6 @@
 </file>
 
 <file path=customXml/item1.xml><?xml version="1.0" encoding="utf-8"?>
-<?mso-contentType ?>
-<FormTemplates xmlns="http://schemas.microsoft.com/sharepoint/v3/contenttype/forms">
-  <Display>DocumentLibraryForm</Display>
-  <Edit>DocumentLibraryForm</Edit>
-  <New>DocumentLibraryForm</New>
-</FormTemplates>
-</file>
-
-<file path=customXml/item2.xml><?xml version="1.0" encoding="utf-8"?>
-<p:properties xmlns:p="http://schemas.microsoft.com/office/2006/metadata/properties" xmlns:xsi="http://www.w3.org/2001/XMLSchema-instance" xmlns:pc="http://schemas.microsoft.com/office/infopath/2007/PartnerControls">
-  <documentManagement/>
-</p:properties>
-</file>
-
-<file path=customXml/item3.xml><?xml version="1.0" encoding="utf-8"?>
 <ct:contentTypeSchema xmlns:ct="http://schemas.microsoft.com/office/2006/metadata/contentType" xmlns:ma="http://schemas.microsoft.com/office/2006/metadata/properties/metaAttributes" ct:_="" ma:_="" ma:contentTypeName="Document" ma:contentTypeID="0x010100B5038BFD166AE2448331F6C3A2654A5C" ma:contentTypeVersion="0" ma:contentTypeDescription="Create a new document." ma:contentTypeScope="" ma:versionID="ae02e2eb6ba22229ebfd6619cbb4a83e">
   <xsd:schema xmlns:xsd="http://www.w3.org/2001/XMLSchema" xmlns:xs="http://www.w3.org/2001/XMLSchema" xmlns:p="http://schemas.microsoft.com/office/2006/metadata/properties" targetNamespace="http://schemas.microsoft.com/office/2006/metadata/properties" ma:root="true" ma:fieldsID="500c6692915ba10984c0aabd49f31b22">
     <xsd:element name="properties">
@@ -8385,10 +9552,33 @@
 </ct:contentTypeSchema>
 </file>
 
+<file path=customXml/item2.xml><?xml version="1.0" encoding="utf-8"?>
+<p:properties xmlns:p="http://schemas.microsoft.com/office/2006/metadata/properties" xmlns:xsi="http://www.w3.org/2001/XMLSchema-instance" xmlns:pc="http://schemas.microsoft.com/office/infopath/2007/PartnerControls">
+  <documentManagement/>
+</p:properties>
+</file>
+
+<file path=customXml/item3.xml><?xml version="1.0" encoding="utf-8"?>
+<?mso-contentType ?>
+<FormTemplates xmlns="http://schemas.microsoft.com/sharepoint/v3/contenttype/forms">
+  <Display>DocumentLibraryForm</Display>
+  <Edit>DocumentLibraryForm</Edit>
+  <New>DocumentLibraryForm</New>
+</FormTemplates>
+</file>
+
 <file path=customXml/itemProps1.xml><?xml version="1.0" encoding="utf-8"?>
-<ds:datastoreItem xmlns:ds="http://schemas.openxmlformats.org/officeDocument/2006/customXml" ds:itemID="{4D0401EF-C93D-4A4C-B5B7-CDE7C86C02E4}">
+<ds:datastoreItem xmlns:ds="http://schemas.openxmlformats.org/officeDocument/2006/customXml" ds:itemID="{E8B1CE6C-3F8C-422F-9B4A-2CCFF5A10D76}">
   <ds:schemaRefs>
-    <ds:schemaRef ds:uri="http://schemas.microsoft.com/sharepoint/v3/contenttype/forms"/>
+    <ds:schemaRef ds:uri="http://schemas.microsoft.com/office/2006/metadata/contentType"/>
+    <ds:schemaRef ds:uri="http://schemas.microsoft.com/office/2006/metadata/properties/metaAttributes"/>
+    <ds:schemaRef ds:uri="http://www.w3.org/2001/XMLSchema"/>
+    <ds:schemaRef ds:uri="http://schemas.microsoft.com/office/2006/metadata/properties"/>
+    <ds:schemaRef ds:uri="http://schemas.openxmlformats.org/package/2006/metadata/core-properties"/>
+    <ds:schemaRef ds:uri="http://purl.org/dc/elements/1.1/"/>
+    <ds:schemaRef ds:uri="http://purl.org/dc/terms/"/>
+    <ds:schemaRef ds:uri="http://schemas.microsoft.com/internal/obd"/>
+    <ds:schemaRef ds:uri="http://schemas.microsoft.com/office/infopath/2007/PartnerControls"/>
   </ds:schemaRefs>
 </ds:datastoreItem>
 </file>
@@ -8403,17 +9593,9 @@
 </file>
 
 <file path=customXml/itemProps3.xml><?xml version="1.0" encoding="utf-8"?>
-<ds:datastoreItem xmlns:ds="http://schemas.openxmlformats.org/officeDocument/2006/customXml" ds:itemID="{E8B1CE6C-3F8C-422F-9B4A-2CCFF5A10D76}">
+<ds:datastoreItem xmlns:ds="http://schemas.openxmlformats.org/officeDocument/2006/customXml" ds:itemID="{4D0401EF-C93D-4A4C-B5B7-CDE7C86C02E4}">
   <ds:schemaRefs>
-    <ds:schemaRef ds:uri="http://schemas.microsoft.com/office/2006/metadata/contentType"/>
-    <ds:schemaRef ds:uri="http://schemas.microsoft.com/office/2006/metadata/properties/metaAttributes"/>
-    <ds:schemaRef ds:uri="http://www.w3.org/2001/XMLSchema"/>
-    <ds:schemaRef ds:uri="http://schemas.microsoft.com/office/2006/metadata/properties"/>
-    <ds:schemaRef ds:uri="http://schemas.openxmlformats.org/package/2006/metadata/core-properties"/>
-    <ds:schemaRef ds:uri="http://purl.org/dc/elements/1.1/"/>
-    <ds:schemaRef ds:uri="http://purl.org/dc/terms/"/>
-    <ds:schemaRef ds:uri="http://schemas.microsoft.com/internal/obd"/>
-    <ds:schemaRef ds:uri="http://schemas.microsoft.com/office/infopath/2007/PartnerControls"/>
+    <ds:schemaRef ds:uri="http://schemas.microsoft.com/sharepoint/v3/contenttype/forms"/>
   </ds:schemaRefs>
 </ds:datastoreItem>
 </file>
</xml_diff>

<commit_message>
implemented log in and sign up
</commit_message>
<xml_diff>
--- a/use_cases.docx
+++ b/use_cases.docx
@@ -283,7 +283,13 @@
               <w:rPr>
                 <w:color w:val="000000" w:themeColor="text1"/>
               </w:rPr>
-              <w:t>bookclubs</w:t>
+              <w:t>BuddyRead</w:t>
+            </w:r>
+            <w:r>
+              <w:rPr>
+                <w:color w:val="000000" w:themeColor="text1"/>
+              </w:rPr>
+              <w:t>s</w:t>
             </w:r>
             <w:proofErr w:type="spellEnd"/>
             <w:r>
@@ -824,7 +830,7 @@
                 <w:bCs/>
                 <w:color w:val="000000" w:themeColor="text1"/>
               </w:rPr>
-              <w:t>bookclub</w:t>
+              <w:t>BuddyRead</w:t>
             </w:r>
             <w:proofErr w:type="spellEnd"/>
           </w:p>
@@ -987,7 +993,7 @@
               <w:rPr>
                 <w:color w:val="000000" w:themeColor="text1"/>
               </w:rPr>
-              <w:t>bookclub</w:t>
+              <w:t>BuddyRead</w:t>
             </w:r>
             <w:proofErr w:type="spellEnd"/>
             <w:r>
@@ -1075,7 +1081,7 @@
               <w:rPr>
                 <w:color w:val="000000" w:themeColor="text1"/>
               </w:rPr>
-              <w:t>bookclub</w:t>
+              <w:t>BuddyRead</w:t>
             </w:r>
             <w:proofErr w:type="spellEnd"/>
           </w:p>
@@ -1196,7 +1202,7 @@
               <w:rPr>
                 <w:color w:val="000000" w:themeColor="text1"/>
               </w:rPr>
-              <w:t>bookclub</w:t>
+              <w:t>BuddyRead</w:t>
             </w:r>
             <w:proofErr w:type="spellEnd"/>
             <w:r>
@@ -1232,7 +1238,7 @@
               <w:rPr>
                 <w:color w:val="000000" w:themeColor="text1"/>
               </w:rPr>
-              <w:t>bookclub</w:t>
+              <w:t>BuddyRead</w:t>
             </w:r>
             <w:proofErr w:type="spellEnd"/>
             <w:r>
@@ -1246,7 +1252,7 @@
               <w:rPr>
                 <w:color w:val="000000" w:themeColor="text1"/>
               </w:rPr>
-              <w:t>bookclub</w:t>
+              <w:t>BuddyRead</w:t>
             </w:r>
             <w:proofErr w:type="spellEnd"/>
           </w:p>
@@ -1321,7 +1327,7 @@
                 <w:bCs/>
                 <w:color w:val="000000" w:themeColor="text1"/>
               </w:rPr>
-              <w:t>Bookclub</w:t>
+              <w:t>BuddyRead</w:t>
             </w:r>
             <w:proofErr w:type="spellEnd"/>
             <w:r>
@@ -1371,7 +1377,7 @@
               <w:rPr>
                 <w:color w:val="000000" w:themeColor="text1"/>
               </w:rPr>
-              <w:t>bookclub</w:t>
+              <w:t>BuddyRead</w:t>
             </w:r>
             <w:proofErr w:type="spellEnd"/>
             <w:r>
@@ -1451,7 +1457,7 @@
               <w:rPr>
                 <w:color w:val="000000" w:themeColor="text1"/>
               </w:rPr>
-              <w:t>bookclub</w:t>
+              <w:t>BuddyRead</w:t>
             </w:r>
             <w:proofErr w:type="spellEnd"/>
           </w:p>
@@ -1581,7 +1587,7 @@
               <w:rPr>
                 <w:color w:val="000000" w:themeColor="text1"/>
               </w:rPr>
-              <w:t>bookclub</w:t>
+              <w:t>BuddyRead</w:t>
             </w:r>
             <w:proofErr w:type="spellEnd"/>
           </w:p>
@@ -1603,7 +1609,13 @@
               <w:rPr>
                 <w:color w:val="000000" w:themeColor="text1"/>
               </w:rPr>
-              <w:t>bookclubs</w:t>
+              <w:t>BuddyRead</w:t>
+            </w:r>
+            <w:r>
+              <w:rPr>
+                <w:color w:val="000000" w:themeColor="text1"/>
+              </w:rPr>
+              <w:t>s</w:t>
             </w:r>
             <w:proofErr w:type="spellEnd"/>
             <w:r>
@@ -1785,7 +1797,7 @@
                 <w:bCs/>
                 <w:color w:val="000000" w:themeColor="text1"/>
               </w:rPr>
-              <w:t>Bookclub</w:t>
+              <w:t>BuddyRead</w:t>
             </w:r>
             <w:proofErr w:type="spellEnd"/>
           </w:p>
@@ -1948,7 +1960,7 @@
               <w:rPr>
                 <w:color w:val="000000" w:themeColor="text1"/>
               </w:rPr>
-              <w:t>bookclub</w:t>
+              <w:t>BuddyRead</w:t>
             </w:r>
             <w:proofErr w:type="spellEnd"/>
             <w:r>
@@ -2036,7 +2048,7 @@
               <w:rPr>
                 <w:color w:val="000000" w:themeColor="text1"/>
               </w:rPr>
-              <w:t>bookclub</w:t>
+              <w:t>BuddyRead</w:t>
             </w:r>
             <w:proofErr w:type="spellEnd"/>
             <w:r>
@@ -2162,7 +2174,13 @@
               <w:rPr>
                 <w:color w:val="000000" w:themeColor="text1"/>
               </w:rPr>
-              <w:t>bookclub’s</w:t>
+              <w:t>BuddyRead</w:t>
+            </w:r>
+            <w:r>
+              <w:rPr>
+                <w:color w:val="000000" w:themeColor="text1"/>
+              </w:rPr>
+              <w:t>’s</w:t>
             </w:r>
             <w:proofErr w:type="spellEnd"/>
             <w:r>
@@ -2243,7 +2261,7 @@
                 <w:bCs/>
                 <w:color w:val="000000" w:themeColor="text1"/>
               </w:rPr>
-              <w:t>bookclub</w:t>
+              <w:t>BuddyRead</w:t>
             </w:r>
             <w:proofErr w:type="spellEnd"/>
           </w:p>
@@ -2276,7 +2294,13 @@
               <w:rPr>
                 <w:color w:val="000000" w:themeColor="text1"/>
               </w:rPr>
-              <w:t>bookclub’s</w:t>
+              <w:t>BuddyRead</w:t>
+            </w:r>
+            <w:r>
+              <w:rPr>
+                <w:color w:val="000000" w:themeColor="text1"/>
+              </w:rPr>
+              <w:t>’s</w:t>
             </w:r>
             <w:proofErr w:type="spellEnd"/>
             <w:r>
@@ -2335,7 +2359,7 @@
               <w:rPr>
                 <w:color w:val="000000" w:themeColor="text1"/>
               </w:rPr>
-              <w:t>bookclub</w:t>
+              <w:t>BuddyRead</w:t>
             </w:r>
             <w:proofErr w:type="spellEnd"/>
             <w:r>
@@ -2349,7 +2373,7 @@
               <w:rPr>
                 <w:color w:val="000000" w:themeColor="text1"/>
               </w:rPr>
-              <w:t>bookclub</w:t>
+              <w:t>BuddyRead</w:t>
             </w:r>
             <w:proofErr w:type="spellEnd"/>
             <w:r>
@@ -2363,7 +2387,13 @@
               <w:rPr>
                 <w:color w:val="000000" w:themeColor="text1"/>
               </w:rPr>
-              <w:t>bookclub’s</w:t>
+              <w:t>BuddyRead</w:t>
+            </w:r>
+            <w:r>
+              <w:rPr>
+                <w:color w:val="000000" w:themeColor="text1"/>
+              </w:rPr>
+              <w:t>’s</w:t>
             </w:r>
             <w:proofErr w:type="spellEnd"/>
             <w:r>
@@ -2490,7 +2520,7 @@
                 <w:bCs/>
                 <w:color w:val="000000" w:themeColor="text1"/>
               </w:rPr>
-              <w:t>bookclub</w:t>
+              <w:t>BuddyRead</w:t>
             </w:r>
             <w:proofErr w:type="spellEnd"/>
             <w:r>
@@ -2545,7 +2575,7 @@
                 <w:bCs/>
                 <w:color w:val="000000" w:themeColor="text1"/>
               </w:rPr>
-              <w:t>bookclub</w:t>
+              <w:t>BuddyRead</w:t>
             </w:r>
             <w:proofErr w:type="spellEnd"/>
             <w:r>
@@ -2575,7 +2605,7 @@
               <w:rPr>
                 <w:color w:val="000000" w:themeColor="text1"/>
               </w:rPr>
-              <w:t>bookclub</w:t>
+              <w:t>BuddyRead</w:t>
             </w:r>
             <w:proofErr w:type="spellEnd"/>
             <w:r>
@@ -2820,7 +2850,7 @@
               <w:rPr>
                 <w:color w:val="000000" w:themeColor="text1"/>
               </w:rPr>
-              <w:t>bookclub</w:t>
+              <w:t>BuddyRead</w:t>
             </w:r>
             <w:proofErr w:type="spellEnd"/>
             <w:r>
@@ -2960,7 +2990,7 @@
               <w:rPr>
                 <w:color w:val="000000" w:themeColor="text1"/>
               </w:rPr>
-              <w:t>bookclub</w:t>
+              <w:t>BuddyRead</w:t>
             </w:r>
             <w:proofErr w:type="spellEnd"/>
           </w:p>
@@ -3110,7 +3140,7 @@
               <w:rPr>
                 <w:color w:val="000000" w:themeColor="text1"/>
               </w:rPr>
-              <w:t>bookclub</w:t>
+              <w:t>BuddyRead</w:t>
             </w:r>
             <w:proofErr w:type="spellEnd"/>
             <w:r>
@@ -3138,7 +3168,13 @@
               <w:rPr>
                 <w:color w:val="000000" w:themeColor="text1"/>
               </w:rPr>
-              <w:t>bookclub’s</w:t>
+              <w:t>BuddyRead</w:t>
+            </w:r>
+            <w:r>
+              <w:rPr>
+                <w:color w:val="000000" w:themeColor="text1"/>
+              </w:rPr>
+              <w:t>’s</w:t>
             </w:r>
             <w:proofErr w:type="spellEnd"/>
             <w:r>
@@ -3277,6 +3313,7 @@
               <w:rPr>
                 <w:color w:val="000000" w:themeColor="text1"/>
               </w:rPr>
+              <w:lastRenderedPageBreak/>
               <w:t>8</w:t>
             </w:r>
             <w:r>
@@ -3309,7 +3346,6 @@
               <w:rPr>
                 <w:color w:val="000000" w:themeColor="text1"/>
               </w:rPr>
-              <w:lastRenderedPageBreak/>
               <w:t>9</w:t>
             </w:r>
             <w:r>
@@ -3343,7 +3379,7 @@
               <w:rPr>
                 <w:color w:val="000000" w:themeColor="text1"/>
               </w:rPr>
-              <w:t>bookclub</w:t>
+              <w:t>BuddyRead</w:t>
             </w:r>
             <w:proofErr w:type="spellEnd"/>
             <w:r>
@@ -3709,7 +3745,7 @@
               <w:rPr>
                 <w:color w:val="000000" w:themeColor="text1"/>
               </w:rPr>
-              <w:t>bookclub</w:t>
+              <w:t>BuddyRead</w:t>
             </w:r>
             <w:proofErr w:type="spellEnd"/>
             <w:r>
@@ -3779,7 +3815,7 @@
               <w:rPr>
                 <w:color w:val="000000" w:themeColor="text1"/>
               </w:rPr>
-              <w:t>bookclub</w:t>
+              <w:t>BuddyRead</w:t>
             </w:r>
             <w:proofErr w:type="spellEnd"/>
             <w:r>
@@ -4255,39 +4291,7 @@
                 <w:bCs/>
                 <w:color w:val="000000" w:themeColor="text1"/>
               </w:rPr>
-              <w:t>UC-</w:t>
-            </w:r>
-            <w:r>
-              <w:rPr>
-                <w:b/>
-                <w:bCs/>
-                <w:color w:val="000000" w:themeColor="text1"/>
-              </w:rPr>
-              <w:t>6</w:t>
-            </w:r>
-            <w:r>
-              <w:rPr>
-                <w:b/>
-                <w:bCs/>
-                <w:color w:val="000000" w:themeColor="text1"/>
-              </w:rPr>
-              <w:t xml:space="preserve">: </w:t>
-            </w:r>
-            <w:r>
-              <w:rPr>
-                <w:b/>
-                <w:bCs/>
-                <w:color w:val="000000" w:themeColor="text1"/>
-              </w:rPr>
-              <w:t>Delete</w:t>
-            </w:r>
-            <w:r>
-              <w:rPr>
-                <w:b/>
-                <w:bCs/>
-                <w:color w:val="000000" w:themeColor="text1"/>
-              </w:rPr>
-              <w:t xml:space="preserve"> Comment</w:t>
+              <w:t>UC-6: Delete Comment</w:t>
             </w:r>
           </w:p>
         </w:tc>
@@ -4442,13 +4446,7 @@
               <w:rPr>
                 <w:color w:val="000000" w:themeColor="text1"/>
               </w:rPr>
-              <w:t xml:space="preserve">A user wants to </w:t>
-            </w:r>
-            <w:r>
-              <w:rPr>
-                <w:color w:val="000000" w:themeColor="text1"/>
-              </w:rPr>
-              <w:t>delete a comment they made</w:t>
+              <w:t>A user wants to delete a comment they made</w:t>
             </w:r>
           </w:p>
         </w:tc>
@@ -4504,13 +4502,7 @@
               <w:rPr>
                 <w:color w:val="000000" w:themeColor="text1"/>
               </w:rPr>
-              <w:t xml:space="preserve">User </w:t>
-            </w:r>
-            <w:r>
-              <w:rPr>
-                <w:color w:val="000000" w:themeColor="text1"/>
-              </w:rPr>
-              <w:t>decides to delete their comment</w:t>
+              <w:t>User decides to delete their comment</w:t>
             </w:r>
           </w:p>
         </w:tc>
@@ -4596,6 +4588,7 @@
               <w:rPr>
                 <w:color w:val="000000" w:themeColor="text1"/>
               </w:rPr>
+              <w:lastRenderedPageBreak/>
               <w:t>Postconditions</w:t>
             </w:r>
           </w:p>
@@ -4622,13 +4615,7 @@
               <w:rPr>
                 <w:color w:val="000000" w:themeColor="text1"/>
               </w:rPr>
-              <w:t xml:space="preserve">POST-1: The comment is </w:t>
-            </w:r>
-            <w:r>
-              <w:rPr>
-                <w:color w:val="000000" w:themeColor="text1"/>
-              </w:rPr>
-              <w:t>deleted</w:t>
+              <w:t>POST-1: The comment is deleted</w:t>
             </w:r>
           </w:p>
         </w:tc>
@@ -4658,7 +4645,6 @@
               <w:rPr>
                 <w:color w:val="000000" w:themeColor="text1"/>
               </w:rPr>
-              <w:lastRenderedPageBreak/>
               <w:t>Normal flow</w:t>
             </w:r>
           </w:p>
@@ -4697,15 +4683,7 @@
                 <w:bCs/>
                 <w:color w:val="000000" w:themeColor="text1"/>
               </w:rPr>
-              <w:t>deletes</w:t>
-            </w:r>
-            <w:r>
-              <w:rPr>
-                <w:b/>
-                <w:bCs/>
-                <w:color w:val="000000" w:themeColor="text1"/>
-              </w:rPr>
-              <w:t xml:space="preserve"> comment</w:t>
+              <w:t>deletes comment</w:t>
             </w:r>
           </w:p>
           <w:p>
@@ -4724,19 +4702,7 @@
               <w:rPr>
                 <w:color w:val="000000" w:themeColor="text1"/>
               </w:rPr>
-              <w:t xml:space="preserve">User chooses to </w:t>
-            </w:r>
-            <w:r>
-              <w:rPr>
-                <w:color w:val="000000" w:themeColor="text1"/>
-              </w:rPr>
-              <w:t>delete</w:t>
-            </w:r>
-            <w:r>
-              <w:rPr>
-                <w:color w:val="000000" w:themeColor="text1"/>
-              </w:rPr>
-              <w:t xml:space="preserve"> their comment</w:t>
+              <w:t>User chooses to delete their comment</w:t>
             </w:r>
           </w:p>
           <w:p>
@@ -4755,13 +4721,7 @@
               <w:rPr>
                 <w:color w:val="000000" w:themeColor="text1"/>
               </w:rPr>
-              <w:t xml:space="preserve">        System </w:t>
-            </w:r>
-            <w:r>
-              <w:rPr>
-                <w:color w:val="000000" w:themeColor="text1"/>
-              </w:rPr>
-              <w:t>asks the user for confirmation</w:t>
+              <w:t xml:space="preserve">        System asks the user for confirmation</w:t>
             </w:r>
           </w:p>
           <w:p>
@@ -4799,13 +4759,7 @@
               <w:rPr>
                 <w:color w:val="000000" w:themeColor="text1"/>
               </w:rPr>
-              <w:t xml:space="preserve">        System </w:t>
-            </w:r>
-            <w:r>
-              <w:rPr>
-                <w:color w:val="000000" w:themeColor="text1"/>
-              </w:rPr>
-              <w:t>deletes the comment</w:t>
+              <w:t xml:space="preserve">        System deletes the comment</w:t>
             </w:r>
           </w:p>
           <w:p>
@@ -8951,6 +8905,7 @@
   <w:style w:type="character" w:default="1" w:styleId="DefaultParagraphFont">
     <w:name w:val="Default Paragraph Font"/>
     <w:uiPriority w:val="1"/>
+    <w:semiHidden/>
     <w:unhideWhenUsed/>
   </w:style>
   <w:style w:type="table" w:default="1" w:styleId="TableNormal">
@@ -9439,6 +9394,21 @@
 </file>
 
 <file path=customXml/item1.xml><?xml version="1.0" encoding="utf-8"?>
+<?mso-contentType ?>
+<FormTemplates xmlns="http://schemas.microsoft.com/sharepoint/v3/contenttype/forms">
+  <Display>DocumentLibraryForm</Display>
+  <Edit>DocumentLibraryForm</Edit>
+  <New>DocumentLibraryForm</New>
+</FormTemplates>
+</file>
+
+<file path=customXml/item2.xml><?xml version="1.0" encoding="utf-8"?>
+<p:properties xmlns:p="http://schemas.microsoft.com/office/2006/metadata/properties" xmlns:xsi="http://www.w3.org/2001/XMLSchema-instance" xmlns:pc="http://schemas.microsoft.com/office/infopath/2007/PartnerControls">
+  <documentManagement/>
+</p:properties>
+</file>
+
+<file path=customXml/item3.xml><?xml version="1.0" encoding="utf-8"?>
 <ct:contentTypeSchema xmlns:ct="http://schemas.microsoft.com/office/2006/metadata/contentType" xmlns:ma="http://schemas.microsoft.com/office/2006/metadata/properties/metaAttributes" ct:_="" ma:_="" ma:contentTypeName="Document" ma:contentTypeID="0x010100B5038BFD166AE2448331F6C3A2654A5C" ma:contentTypeVersion="0" ma:contentTypeDescription="Create a new document." ma:contentTypeScope="" ma:versionID="ae02e2eb6ba22229ebfd6619cbb4a83e">
   <xsd:schema xmlns:xsd="http://www.w3.org/2001/XMLSchema" xmlns:xs="http://www.w3.org/2001/XMLSchema" xmlns:p="http://schemas.microsoft.com/office/2006/metadata/properties" targetNamespace="http://schemas.microsoft.com/office/2006/metadata/properties" ma:root="true" ma:fieldsID="500c6692915ba10984c0aabd49f31b22">
     <xsd:element name="properties">
@@ -9552,33 +9522,10 @@
 </ct:contentTypeSchema>
 </file>
 
-<file path=customXml/item2.xml><?xml version="1.0" encoding="utf-8"?>
-<p:properties xmlns:p="http://schemas.microsoft.com/office/2006/metadata/properties" xmlns:xsi="http://www.w3.org/2001/XMLSchema-instance" xmlns:pc="http://schemas.microsoft.com/office/infopath/2007/PartnerControls">
-  <documentManagement/>
-</p:properties>
-</file>
-
-<file path=customXml/item3.xml><?xml version="1.0" encoding="utf-8"?>
-<?mso-contentType ?>
-<FormTemplates xmlns="http://schemas.microsoft.com/sharepoint/v3/contenttype/forms">
-  <Display>DocumentLibraryForm</Display>
-  <Edit>DocumentLibraryForm</Edit>
-  <New>DocumentLibraryForm</New>
-</FormTemplates>
-</file>
-
 <file path=customXml/itemProps1.xml><?xml version="1.0" encoding="utf-8"?>
-<ds:datastoreItem xmlns:ds="http://schemas.openxmlformats.org/officeDocument/2006/customXml" ds:itemID="{E8B1CE6C-3F8C-422F-9B4A-2CCFF5A10D76}">
+<ds:datastoreItem xmlns:ds="http://schemas.openxmlformats.org/officeDocument/2006/customXml" ds:itemID="{4D0401EF-C93D-4A4C-B5B7-CDE7C86C02E4}">
   <ds:schemaRefs>
-    <ds:schemaRef ds:uri="http://schemas.microsoft.com/office/2006/metadata/contentType"/>
-    <ds:schemaRef ds:uri="http://schemas.microsoft.com/office/2006/metadata/properties/metaAttributes"/>
-    <ds:schemaRef ds:uri="http://www.w3.org/2001/XMLSchema"/>
-    <ds:schemaRef ds:uri="http://schemas.microsoft.com/office/2006/metadata/properties"/>
-    <ds:schemaRef ds:uri="http://schemas.openxmlformats.org/package/2006/metadata/core-properties"/>
-    <ds:schemaRef ds:uri="http://purl.org/dc/elements/1.1/"/>
-    <ds:schemaRef ds:uri="http://purl.org/dc/terms/"/>
-    <ds:schemaRef ds:uri="http://schemas.microsoft.com/internal/obd"/>
-    <ds:schemaRef ds:uri="http://schemas.microsoft.com/office/infopath/2007/PartnerControls"/>
+    <ds:schemaRef ds:uri="http://schemas.microsoft.com/sharepoint/v3/contenttype/forms"/>
   </ds:schemaRefs>
 </ds:datastoreItem>
 </file>
@@ -9593,9 +9540,17 @@
 </file>
 
 <file path=customXml/itemProps3.xml><?xml version="1.0" encoding="utf-8"?>
-<ds:datastoreItem xmlns:ds="http://schemas.openxmlformats.org/officeDocument/2006/customXml" ds:itemID="{4D0401EF-C93D-4A4C-B5B7-CDE7C86C02E4}">
+<ds:datastoreItem xmlns:ds="http://schemas.openxmlformats.org/officeDocument/2006/customXml" ds:itemID="{E8B1CE6C-3F8C-422F-9B4A-2CCFF5A10D76}">
   <ds:schemaRefs>
-    <ds:schemaRef ds:uri="http://schemas.microsoft.com/sharepoint/v3/contenttype/forms"/>
+    <ds:schemaRef ds:uri="http://schemas.microsoft.com/office/2006/metadata/contentType"/>
+    <ds:schemaRef ds:uri="http://schemas.microsoft.com/office/2006/metadata/properties/metaAttributes"/>
+    <ds:schemaRef ds:uri="http://www.w3.org/2001/XMLSchema"/>
+    <ds:schemaRef ds:uri="http://schemas.microsoft.com/office/2006/metadata/properties"/>
+    <ds:schemaRef ds:uri="http://schemas.openxmlformats.org/package/2006/metadata/core-properties"/>
+    <ds:schemaRef ds:uri="http://purl.org/dc/elements/1.1/"/>
+    <ds:schemaRef ds:uri="http://purl.org/dc/terms/"/>
+    <ds:schemaRef ds:uri="http://schemas.microsoft.com/internal/obd"/>
+    <ds:schemaRef ds:uri="http://schemas.microsoft.com/office/infopath/2007/PartnerControls"/>
   </ds:schemaRefs>
 </ds:datastoreItem>
 </file>
</xml_diff>